<commit_message>
Belgeler: hocaya sorular §12 ve yol haritası
HOCAYA-SORULAR'a 13 soruluk yeni bölüm: deneme süreleri ve konu
dağılımı, deneme sorularının havuzdan ayrılması, kâğıt kuralları, ipucu
ve çözüm standardı, video, kazanım kartları, bildirim ve koça soru
sorumluları, ödev ve seri kuralları, süre analizi eşikleri. Word sürümü
yeniden üretildi. Yol haritasında 21 Ekim'de eklenenler işaretlendi.

Co-Authored-By: Claude Opus 5.5 <noreply@anthropic.com>
</commit_message>
<xml_diff>
--- a/HOCAYA-SORULAR.docx
+++ b/HOCAYA-SORULAR.docx
@@ -11339,6 +11339,2546 @@
       </w:r>
       <w:r>
         <w:t xml:space="preserve"> — Yüklenen sorular varsayılan olarak taslak; içerik yetkisi olan kişi isterse "doğrudan yayına al" seçeneğiyle hemen yayınlayabiliyor. Bu seçenek kalsın mı, yoksa her soru önce incelemeden mi geçsin (Soru 10.1)?</w:t>
+      </w:r>
+    </w:p>
+    <w:tbl>
+      <w:tblPr>
+        <w:tblW w:type="dxa" w:w="9638"/>
+        <w:tblBorders>
+          <w:top w:val="single" w:color="auto" w:sz="4"/>
+          <w:left w:val="single" w:color="auto" w:sz="4"/>
+          <w:bottom w:val="single" w:color="auto" w:sz="4"/>
+          <w:right w:val="single" w:color="auto" w:sz="4"/>
+          <w:insideH w:val="single" w:color="auto" w:sz="4"/>
+          <w:insideV w:val="single" w:color="auto" w:sz="4"/>
+        </w:tblBorders>
+        <w:tblLayout w:type="fixed"/>
+      </w:tblPr>
+      <w:tblGrid>
+        <w:gridCol w:w="9638"/>
+      </w:tblGrid>
+      <w:tr>
+        <w:tc>
+          <w:tcPr>
+            <w:tcW w:type="dxa" w:w="9638"/>
+            <w:tcBorders>
+              <w:top w:val="single" w:color="D6E4F7" w:sz="6"/>
+              <w:left w:val="single" w:color="D6E4F7" w:sz="6"/>
+              <w:bottom w:val="single" w:color="D6E4F7" w:sz="6"/>
+              <w:right w:val="single" w:color="D6E4F7" w:sz="6"/>
+            </w:tcBorders>
+            <w:shd w:fill="F6F9FE" w:color="auto" w:val="clear"/>
+            <w:tcMar>
+              <w:top w:type="dxa" w:w="90"/>
+              <w:left w:type="dxa" w:w="140"/>
+              <w:bottom w:type="dxa" w:w="90"/>
+              <w:right w:type="dxa" w:w="140"/>
+            </w:tcMar>
+          </w:tcPr>
+          <w:p>
+            <w:pPr>
+              <w:spacing w:after="40"/>
+            </w:pPr>
+            <w:r>
+              <w:rPr>
+                <w:b/>
+                <w:bCs/>
+                <w:color w:val="1A5FB4"/>
+                <w:sz w:val="18"/>
+                <w:szCs w:val="18"/>
+              </w:rPr>
+              <w:t xml:space="preserve">Cevap</w:t>
+            </w:r>
+          </w:p>
+          <w:p>
+            <w:pPr>
+              <w:spacing w:after="60"/>
+            </w:pPr>
+            <w:r>
+              <w:t xml:space="preserve"/>
+            </w:r>
+          </w:p>
+          <w:p>
+            <w:pPr>
+              <w:spacing w:after="60"/>
+            </w:pPr>
+            <w:r>
+              <w:t xml:space="preserve"/>
+            </w:r>
+          </w:p>
+          <w:p>
+            <w:pPr>
+              <w:spacing w:after="60"/>
+            </w:pPr>
+            <w:r>
+              <w:t xml:space="preserve"/>
+            </w:r>
+          </w:p>
+        </w:tc>
+      </w:tr>
+    </w:tbl>
+    <w:p>
+      <w:pPr>
+        <w:spacing w:after="160"/>
+      </w:pPr>
+    </w:p>
+    <w:p>
+      <w:pPr>
+        <w:pStyle w:val="Heading1"/>
+        <w:keepNext/>
+      </w:pPr>
+      <w:r>
+        <w:t xml:space="preserve">12. Deneme, kâğıt, ipucu ve koçluk (yeni, 21 Ekim)</w:t>
+      </w:r>
+    </w:p>
+    <w:p>
+      <w:pPr>
+        <w:keepNext/>
+        <w:spacing w:after="120"/>
+      </w:pPr>
+      <w:r>
+        <w:t xml:space="preserve">Bu turda şunlar eklendi:</w:t>
+      </w:r>
+    </w:p>
+    <w:p>
+      <w:pPr>
+        <w:pStyle w:val="ListParagraph"/>
+        <w:keepNext/>
+        <w:numPr>
+          <w:ilvl w:val="0"/>
+          <w:numId w:val="2"/>
+        </w:numPr>
+        <w:spacing w:after="60"/>
+      </w:pPr>
+      <w:r>
+        <w:t xml:space="preserve">Deneme sınavı ve kâğıtta çözülen testler (optik form).</w:t>
+      </w:r>
+    </w:p>
+    <w:p>
+      <w:pPr>
+        <w:pStyle w:val="ListParagraph"/>
+        <w:keepNext/>
+        <w:numPr>
+          <w:ilvl w:val="0"/>
+          <w:numId w:val="2"/>
+        </w:numPr>
+        <w:spacing w:after="60"/>
+      </w:pPr>
+      <w:r>
+        <w:t xml:space="preserve">Alıştırmada ipucu ve adım adım açılan çözüm; video çözüm.</w:t>
+      </w:r>
+    </w:p>
+    <w:p>
+      <w:pPr>
+        <w:pStyle w:val="ListParagraph"/>
+        <w:keepNext/>
+        <w:numPr>
+          <w:ilvl w:val="0"/>
+          <w:numId w:val="2"/>
+        </w:numPr>
+        <w:spacing w:after="60"/>
+      </w:pPr>
+      <w:r>
+        <w:t xml:space="preserve">Kazanım özet kartları ve öğrencinin hata bildirimi.</w:t>
+      </w:r>
+    </w:p>
+    <w:p>
+      <w:pPr>
+        <w:pStyle w:val="ListParagraph"/>
+        <w:keepNext w:val="false"/>
+        <w:numPr>
+          <w:ilvl w:val="0"/>
+          <w:numId w:val="2"/>
+        </w:numPr>
+        <w:spacing w:after="60"/>
+      </w:pPr>
+      <w:r>
+        <w:t xml:space="preserve">Koça soru, grup ve ödev; seri ve günlük hedef.</w:t>
+      </w:r>
+    </w:p>
+    <w:p>
+      <w:pPr>
+        <w:spacing w:after="60"/>
+      </w:pPr>
+    </w:p>
+    <w:p>
+      <w:pPr>
+        <w:keepNext w:val="false"/>
+        <w:spacing w:after="120"/>
+      </w:pPr>
+      <w:r>
+        <w:t xml:space="preserve">Hepsi çalışıyor. Aşağıdakiler içerik ve işleyiş kararı.</w:t>
+      </w:r>
+    </w:p>
+    <w:p>
+      <w:pPr>
+        <w:keepNext/>
+        <w:keepLines/>
+        <w:spacing w:after="100" w:before="200"/>
+      </w:pPr>
+      <w:r>
+        <w:rPr>
+          <w:b/>
+          <w:bCs/>
+          <w:color w:val="1A5FB4"/>
+        </w:rPr>
+        <w:t xml:space="preserve">Soru 12.1</w:t>
+      </w:r>
+      <w:r>
+        <w:t xml:space="preserve"> — Deneme sürelerini, matematik ayrı oturum olmadığı için sınavın resmî süresini soru sayısına oranlayarak koyduk. Panelde her deneme için değiştirilebiliyor. Doğru mu, öğrenciye matematik için kaç dakika önerirsiniz?</w:t>
+      </w:r>
+    </w:p>
+    <w:tbl>
+      <w:tblPr>
+        <w:tblW w:type="dxa" w:w="9638"/>
+        <w:tblBorders>
+          <w:top w:val="single" w:color="auto" w:sz="4"/>
+          <w:left w:val="single" w:color="auto" w:sz="4"/>
+          <w:bottom w:val="single" w:color="auto" w:sz="4"/>
+          <w:right w:val="single" w:color="auto" w:sz="4"/>
+          <w:insideH w:val="single" w:color="auto" w:sz="4"/>
+          <w:insideV w:val="single" w:color="auto" w:sz="4"/>
+        </w:tblBorders>
+        <w:tblLayout w:type="fixed"/>
+      </w:tblPr>
+      <w:tblGrid>
+        <w:gridCol w:w="2482"/>
+        <w:gridCol w:w="2482"/>
+        <w:gridCol w:w="4674"/>
+      </w:tblGrid>
+      <w:tr>
+        <w:trPr>
+          <w:cantSplit/>
+          <w:tblHeader/>
+        </w:trPr>
+        <w:tc>
+          <w:tcPr>
+            <w:tcW w:type="dxa" w:w="2482"/>
+            <w:tcBorders>
+              <w:top w:val="single" w:color="17305E" w:sz="4"/>
+              <w:left w:val="single" w:color="17305E" w:sz="4"/>
+              <w:bottom w:val="single" w:color="17305E" w:sz="4"/>
+              <w:right w:val="single" w:color="17305E" w:sz="4"/>
+            </w:tcBorders>
+            <w:shd w:fill="17305E" w:color="auto" w:val="clear"/>
+            <w:tcMar>
+              <w:top w:type="dxa" w:w="70"/>
+              <w:left w:type="dxa" w:w="110"/>
+              <w:bottom w:type="dxa" w:w="70"/>
+              <w:right w:type="dxa" w:w="110"/>
+            </w:tcMar>
+            <w:vAlign w:val="center"/>
+          </w:tcPr>
+          <w:p>
+            <w:pPr>
+              <w:keepNext/>
+              <w:jc w:val="left"/>
+            </w:pPr>
+            <w:r>
+              <w:rPr>
+                <w:b/>
+                <w:bCs/>
+                <w:color w:val="FFFFFF"/>
+                <w:sz w:val="19"/>
+                <w:szCs w:val="19"/>
+              </w:rPr>
+              <w:t xml:space="preserve">Sınav</w:t>
+            </w:r>
+          </w:p>
+        </w:tc>
+        <w:tc>
+          <w:tcPr>
+            <w:tcW w:type="dxa" w:w="2482"/>
+            <w:tcBorders>
+              <w:top w:val="single" w:color="17305E" w:sz="4"/>
+              <w:left w:val="single" w:color="17305E" w:sz="4"/>
+              <w:bottom w:val="single" w:color="17305E" w:sz="4"/>
+              <w:right w:val="single" w:color="17305E" w:sz="4"/>
+            </w:tcBorders>
+            <w:shd w:fill="17305E" w:color="auto" w:val="clear"/>
+            <w:tcMar>
+              <w:top w:type="dxa" w:w="70"/>
+              <w:left w:type="dxa" w:w="110"/>
+              <w:bottom w:type="dxa" w:w="70"/>
+              <w:right w:type="dxa" w:w="110"/>
+            </w:tcMar>
+            <w:vAlign w:val="center"/>
+          </w:tcPr>
+          <w:p>
+            <w:pPr>
+              <w:keepNext/>
+              <w:jc w:val="left"/>
+            </w:pPr>
+            <w:r>
+              <w:rPr>
+                <w:b/>
+                <w:bCs/>
+                <w:color w:val="FFFFFF"/>
+                <w:sz w:val="19"/>
+                <w:szCs w:val="19"/>
+              </w:rPr>
+              <w:t xml:space="preserve">Soru</w:t>
+            </w:r>
+          </w:p>
+        </w:tc>
+        <w:tc>
+          <w:tcPr>
+            <w:tcW w:type="dxa" w:w="4674"/>
+            <w:tcBorders>
+              <w:top w:val="single" w:color="17305E" w:sz="4"/>
+              <w:left w:val="single" w:color="17305E" w:sz="4"/>
+              <w:bottom w:val="single" w:color="17305E" w:sz="4"/>
+              <w:right w:val="single" w:color="17305E" w:sz="4"/>
+            </w:tcBorders>
+            <w:shd w:fill="17305E" w:color="auto" w:val="clear"/>
+            <w:tcMar>
+              <w:top w:type="dxa" w:w="70"/>
+              <w:left w:type="dxa" w:w="110"/>
+              <w:bottom w:type="dxa" w:w="70"/>
+              <w:right w:type="dxa" w:w="110"/>
+            </w:tcMar>
+            <w:vAlign w:val="center"/>
+          </w:tcPr>
+          <w:p>
+            <w:pPr>
+              <w:keepNext/>
+              <w:jc w:val="left"/>
+            </w:pPr>
+            <w:r>
+              <w:rPr>
+                <w:b/>
+                <w:bCs/>
+                <w:color w:val="FFFFFF"/>
+                <w:sz w:val="19"/>
+                <w:szCs w:val="19"/>
+              </w:rPr>
+              <w:t xml:space="preserve">Önerilen süre</w:t>
+            </w:r>
+          </w:p>
+        </w:tc>
+      </w:tr>
+      <w:tr>
+        <w:trPr>
+          <w:cantSplit/>
+        </w:trPr>
+        <w:tc>
+          <w:tcPr>
+            <w:tcW w:type="dxa" w:w="2482"/>
+            <w:tcBorders>
+              <w:top w:val="single" w:color="C9D3E3" w:sz="4"/>
+              <w:left w:val="single" w:color="C9D3E3" w:sz="4"/>
+              <w:bottom w:val="single" w:color="C9D3E3" w:sz="4"/>
+              <w:right w:val="single" w:color="C9D3E3" w:sz="4"/>
+            </w:tcBorders>
+            <w:tcMar>
+              <w:top w:type="dxa" w:w="70"/>
+              <w:left w:type="dxa" w:w="110"/>
+              <w:bottom w:type="dxa" w:w="70"/>
+              <w:right w:type="dxa" w:w="110"/>
+            </w:tcMar>
+            <w:vAlign w:val="center"/>
+          </w:tcPr>
+          <w:p>
+            <w:pPr>
+              <w:keepNext/>
+              <w:jc w:val="left"/>
+            </w:pPr>
+            <w:r>
+              <w:rPr>
+                <w:color w:val="111834"/>
+                <w:sz w:val="19"/>
+                <w:szCs w:val="19"/>
+              </w:rPr>
+              <w:t xml:space="preserve">LGS</w:t>
+            </w:r>
+          </w:p>
+        </w:tc>
+        <w:tc>
+          <w:tcPr>
+            <w:tcW w:type="dxa" w:w="2482"/>
+            <w:tcBorders>
+              <w:top w:val="single" w:color="C9D3E3" w:sz="4"/>
+              <w:left w:val="single" w:color="C9D3E3" w:sz="4"/>
+              <w:bottom w:val="single" w:color="C9D3E3" w:sz="4"/>
+              <w:right w:val="single" w:color="C9D3E3" w:sz="4"/>
+            </w:tcBorders>
+            <w:tcMar>
+              <w:top w:type="dxa" w:w="70"/>
+              <w:left w:type="dxa" w:w="110"/>
+              <w:bottom w:type="dxa" w:w="70"/>
+              <w:right w:type="dxa" w:w="110"/>
+            </w:tcMar>
+            <w:vAlign w:val="center"/>
+          </w:tcPr>
+          <w:p>
+            <w:pPr>
+              <w:keepNext/>
+              <w:jc w:val="left"/>
+            </w:pPr>
+            <w:r>
+              <w:rPr>
+                <w:color w:val="111834"/>
+                <w:sz w:val="19"/>
+                <w:szCs w:val="19"/>
+              </w:rPr>
+              <w:t xml:space="preserve">20</w:t>
+            </w:r>
+          </w:p>
+        </w:tc>
+        <w:tc>
+          <w:tcPr>
+            <w:tcW w:type="dxa" w:w="4674"/>
+            <w:tcBorders>
+              <w:top w:val="single" w:color="C9D3E3" w:sz="4"/>
+              <w:left w:val="single" w:color="C9D3E3" w:sz="4"/>
+              <w:bottom w:val="single" w:color="C9D3E3" w:sz="4"/>
+              <w:right w:val="single" w:color="C9D3E3" w:sz="4"/>
+            </w:tcBorders>
+            <w:tcMar>
+              <w:top w:type="dxa" w:w="70"/>
+              <w:left w:type="dxa" w:w="110"/>
+              <w:bottom w:type="dxa" w:w="70"/>
+              <w:right w:type="dxa" w:w="110"/>
+            </w:tcMar>
+            <w:vAlign w:val="center"/>
+          </w:tcPr>
+          <w:p>
+            <w:pPr>
+              <w:keepNext/>
+              <w:jc w:val="left"/>
+            </w:pPr>
+            <w:r>
+              <w:rPr>
+                <w:color w:val="111834"/>
+                <w:sz w:val="19"/>
+                <w:szCs w:val="19"/>
+              </w:rPr>
+              <w:t xml:space="preserve">40 dk</w:t>
+            </w:r>
+          </w:p>
+        </w:tc>
+      </w:tr>
+      <w:tr>
+        <w:trPr>
+          <w:cantSplit/>
+        </w:trPr>
+        <w:tc>
+          <w:tcPr>
+            <w:tcW w:type="dxa" w:w="2482"/>
+            <w:tcBorders>
+              <w:top w:val="single" w:color="C9D3E3" w:sz="4"/>
+              <w:left w:val="single" w:color="C9D3E3" w:sz="4"/>
+              <w:bottom w:val="single" w:color="C9D3E3" w:sz="4"/>
+              <w:right w:val="single" w:color="C9D3E3" w:sz="4"/>
+            </w:tcBorders>
+            <w:tcMar>
+              <w:top w:type="dxa" w:w="70"/>
+              <w:left w:type="dxa" w:w="110"/>
+              <w:bottom w:type="dxa" w:w="70"/>
+              <w:right w:type="dxa" w:w="110"/>
+            </w:tcMar>
+            <w:vAlign w:val="center"/>
+          </w:tcPr>
+          <w:p>
+            <w:pPr>
+              <w:keepNext/>
+              <w:jc w:val="left"/>
+            </w:pPr>
+            <w:r>
+              <w:rPr>
+                <w:color w:val="111834"/>
+                <w:sz w:val="19"/>
+                <w:szCs w:val="19"/>
+              </w:rPr>
+              <w:t xml:space="preserve">TYT</w:t>
+            </w:r>
+          </w:p>
+        </w:tc>
+        <w:tc>
+          <w:tcPr>
+            <w:tcW w:type="dxa" w:w="2482"/>
+            <w:tcBorders>
+              <w:top w:val="single" w:color="C9D3E3" w:sz="4"/>
+              <w:left w:val="single" w:color="C9D3E3" w:sz="4"/>
+              <w:bottom w:val="single" w:color="C9D3E3" w:sz="4"/>
+              <w:right w:val="single" w:color="C9D3E3" w:sz="4"/>
+            </w:tcBorders>
+            <w:tcMar>
+              <w:top w:type="dxa" w:w="70"/>
+              <w:left w:type="dxa" w:w="110"/>
+              <w:bottom w:type="dxa" w:w="70"/>
+              <w:right w:type="dxa" w:w="110"/>
+            </w:tcMar>
+            <w:vAlign w:val="center"/>
+          </w:tcPr>
+          <w:p>
+            <w:pPr>
+              <w:keepNext/>
+              <w:jc w:val="left"/>
+            </w:pPr>
+            <w:r>
+              <w:rPr>
+                <w:color w:val="111834"/>
+                <w:sz w:val="19"/>
+                <w:szCs w:val="19"/>
+              </w:rPr>
+              <w:t xml:space="preserve">40</w:t>
+            </w:r>
+          </w:p>
+        </w:tc>
+        <w:tc>
+          <w:tcPr>
+            <w:tcW w:type="dxa" w:w="4674"/>
+            <w:tcBorders>
+              <w:top w:val="single" w:color="C9D3E3" w:sz="4"/>
+              <w:left w:val="single" w:color="C9D3E3" w:sz="4"/>
+              <w:bottom w:val="single" w:color="C9D3E3" w:sz="4"/>
+              <w:right w:val="single" w:color="C9D3E3" w:sz="4"/>
+            </w:tcBorders>
+            <w:tcMar>
+              <w:top w:type="dxa" w:w="70"/>
+              <w:left w:type="dxa" w:w="110"/>
+              <w:bottom w:type="dxa" w:w="70"/>
+              <w:right w:type="dxa" w:w="110"/>
+            </w:tcMar>
+            <w:vAlign w:val="center"/>
+          </w:tcPr>
+          <w:p>
+            <w:pPr>
+              <w:keepNext/>
+              <w:jc w:val="left"/>
+            </w:pPr>
+            <w:r>
+              <w:rPr>
+                <w:color w:val="111834"/>
+                <w:sz w:val="19"/>
+                <w:szCs w:val="19"/>
+              </w:rPr>
+              <w:t xml:space="preserve">55 dk</w:t>
+            </w:r>
+          </w:p>
+        </w:tc>
+      </w:tr>
+      <w:tr>
+        <w:trPr>
+          <w:cantSplit/>
+        </w:trPr>
+        <w:tc>
+          <w:tcPr>
+            <w:tcW w:type="dxa" w:w="2482"/>
+            <w:tcBorders>
+              <w:top w:val="single" w:color="C9D3E3" w:sz="4"/>
+              <w:left w:val="single" w:color="C9D3E3" w:sz="4"/>
+              <w:bottom w:val="single" w:color="C9D3E3" w:sz="4"/>
+              <w:right w:val="single" w:color="C9D3E3" w:sz="4"/>
+            </w:tcBorders>
+            <w:tcMar>
+              <w:top w:type="dxa" w:w="70"/>
+              <w:left w:type="dxa" w:w="110"/>
+              <w:bottom w:type="dxa" w:w="70"/>
+              <w:right w:type="dxa" w:w="110"/>
+            </w:tcMar>
+            <w:vAlign w:val="center"/>
+          </w:tcPr>
+          <w:p>
+            <w:pPr>
+              <w:keepNext/>
+              <w:jc w:val="left"/>
+            </w:pPr>
+            <w:r>
+              <w:rPr>
+                <w:color w:val="111834"/>
+                <w:sz w:val="19"/>
+                <w:szCs w:val="19"/>
+              </w:rPr>
+              <w:t xml:space="preserve">AYT</w:t>
+            </w:r>
+          </w:p>
+        </w:tc>
+        <w:tc>
+          <w:tcPr>
+            <w:tcW w:type="dxa" w:w="2482"/>
+            <w:tcBorders>
+              <w:top w:val="single" w:color="C9D3E3" w:sz="4"/>
+              <w:left w:val="single" w:color="C9D3E3" w:sz="4"/>
+              <w:bottom w:val="single" w:color="C9D3E3" w:sz="4"/>
+              <w:right w:val="single" w:color="C9D3E3" w:sz="4"/>
+            </w:tcBorders>
+            <w:tcMar>
+              <w:top w:type="dxa" w:w="70"/>
+              <w:left w:type="dxa" w:w="110"/>
+              <w:bottom w:type="dxa" w:w="70"/>
+              <w:right w:type="dxa" w:w="110"/>
+            </w:tcMar>
+            <w:vAlign w:val="center"/>
+          </w:tcPr>
+          <w:p>
+            <w:pPr>
+              <w:keepNext/>
+              <w:jc w:val="left"/>
+            </w:pPr>
+            <w:r>
+              <w:rPr>
+                <w:color w:val="111834"/>
+                <w:sz w:val="19"/>
+                <w:szCs w:val="19"/>
+              </w:rPr>
+              <w:t xml:space="preserve">40</w:t>
+            </w:r>
+          </w:p>
+        </w:tc>
+        <w:tc>
+          <w:tcPr>
+            <w:tcW w:type="dxa" w:w="4674"/>
+            <w:tcBorders>
+              <w:top w:val="single" w:color="C9D3E3" w:sz="4"/>
+              <w:left w:val="single" w:color="C9D3E3" w:sz="4"/>
+              <w:bottom w:val="single" w:color="C9D3E3" w:sz="4"/>
+              <w:right w:val="single" w:color="C9D3E3" w:sz="4"/>
+            </w:tcBorders>
+            <w:tcMar>
+              <w:top w:type="dxa" w:w="70"/>
+              <w:left w:type="dxa" w:w="110"/>
+              <w:bottom w:type="dxa" w:w="70"/>
+              <w:right w:type="dxa" w:w="110"/>
+            </w:tcMar>
+            <w:vAlign w:val="center"/>
+          </w:tcPr>
+          <w:p>
+            <w:pPr>
+              <w:keepNext/>
+              <w:jc w:val="left"/>
+            </w:pPr>
+            <w:r>
+              <w:rPr>
+                <w:color w:val="111834"/>
+                <w:sz w:val="19"/>
+                <w:szCs w:val="19"/>
+              </w:rPr>
+              <w:t xml:space="preserve">45 dk</w:t>
+            </w:r>
+          </w:p>
+        </w:tc>
+      </w:tr>
+      <w:tr>
+        <w:trPr>
+          <w:cantSplit/>
+        </w:trPr>
+        <w:tc>
+          <w:tcPr>
+            <w:tcW w:type="dxa" w:w="2482"/>
+            <w:tcBorders>
+              <w:top w:val="single" w:color="C9D3E3" w:sz="4"/>
+              <w:left w:val="single" w:color="C9D3E3" w:sz="4"/>
+              <w:bottom w:val="single" w:color="C9D3E3" w:sz="4"/>
+              <w:right w:val="single" w:color="C9D3E3" w:sz="4"/>
+            </w:tcBorders>
+            <w:tcMar>
+              <w:top w:type="dxa" w:w="70"/>
+              <w:left w:type="dxa" w:w="110"/>
+              <w:bottom w:type="dxa" w:w="70"/>
+              <w:right w:type="dxa" w:w="110"/>
+            </w:tcMar>
+            <w:vAlign w:val="center"/>
+          </w:tcPr>
+          <w:p>
+            <w:pPr>
+              <w:keepNext/>
+              <w:jc w:val="left"/>
+            </w:pPr>
+            <w:r>
+              <w:rPr>
+                <w:color w:val="111834"/>
+                <w:sz w:val="19"/>
+                <w:szCs w:val="19"/>
+              </w:rPr>
+              <w:t xml:space="preserve">KPSS</w:t>
+            </w:r>
+          </w:p>
+        </w:tc>
+        <w:tc>
+          <w:tcPr>
+            <w:tcW w:type="dxa" w:w="2482"/>
+            <w:tcBorders>
+              <w:top w:val="single" w:color="C9D3E3" w:sz="4"/>
+              <w:left w:val="single" w:color="C9D3E3" w:sz="4"/>
+              <w:bottom w:val="single" w:color="C9D3E3" w:sz="4"/>
+              <w:right w:val="single" w:color="C9D3E3" w:sz="4"/>
+            </w:tcBorders>
+            <w:tcMar>
+              <w:top w:type="dxa" w:w="70"/>
+              <w:left w:type="dxa" w:w="110"/>
+              <w:bottom w:type="dxa" w:w="70"/>
+              <w:right w:type="dxa" w:w="110"/>
+            </w:tcMar>
+            <w:vAlign w:val="center"/>
+          </w:tcPr>
+          <w:p>
+            <w:pPr>
+              <w:keepNext/>
+              <w:jc w:val="left"/>
+            </w:pPr>
+            <w:r>
+              <w:rPr>
+                <w:color w:val="111834"/>
+                <w:sz w:val="19"/>
+                <w:szCs w:val="19"/>
+              </w:rPr>
+              <w:t xml:space="preserve">30</w:t>
+            </w:r>
+          </w:p>
+        </w:tc>
+        <w:tc>
+          <w:tcPr>
+            <w:tcW w:type="dxa" w:w="4674"/>
+            <w:tcBorders>
+              <w:top w:val="single" w:color="C9D3E3" w:sz="4"/>
+              <w:left w:val="single" w:color="C9D3E3" w:sz="4"/>
+              <w:bottom w:val="single" w:color="C9D3E3" w:sz="4"/>
+              <w:right w:val="single" w:color="C9D3E3" w:sz="4"/>
+            </w:tcBorders>
+            <w:tcMar>
+              <w:top w:type="dxa" w:w="70"/>
+              <w:left w:type="dxa" w:w="110"/>
+              <w:bottom w:type="dxa" w:w="70"/>
+              <w:right w:type="dxa" w:w="110"/>
+            </w:tcMar>
+            <w:vAlign w:val="center"/>
+          </w:tcPr>
+          <w:p>
+            <w:pPr>
+              <w:keepNext/>
+              <w:jc w:val="left"/>
+            </w:pPr>
+            <w:r>
+              <w:rPr>
+                <w:color w:val="111834"/>
+                <w:sz w:val="19"/>
+                <w:szCs w:val="19"/>
+              </w:rPr>
+              <w:t xml:space="preserve">35 dk</w:t>
+            </w:r>
+          </w:p>
+        </w:tc>
+      </w:tr>
+      <w:tr>
+        <w:trPr>
+          <w:cantSplit/>
+        </w:trPr>
+        <w:tc>
+          <w:tcPr>
+            <w:tcW w:type="dxa" w:w="2482"/>
+            <w:tcBorders>
+              <w:top w:val="single" w:color="C9D3E3" w:sz="4"/>
+              <w:left w:val="single" w:color="C9D3E3" w:sz="4"/>
+              <w:bottom w:val="single" w:color="C9D3E3" w:sz="4"/>
+              <w:right w:val="single" w:color="C9D3E3" w:sz="4"/>
+            </w:tcBorders>
+            <w:tcMar>
+              <w:top w:type="dxa" w:w="70"/>
+              <w:left w:type="dxa" w:w="110"/>
+              <w:bottom w:type="dxa" w:w="70"/>
+              <w:right w:type="dxa" w:w="110"/>
+            </w:tcMar>
+            <w:vAlign w:val="center"/>
+          </w:tcPr>
+          <w:p>
+            <w:pPr>
+              <w:keepNext/>
+              <w:jc w:val="left"/>
+            </w:pPr>
+            <w:r>
+              <w:rPr>
+                <w:color w:val="111834"/>
+                <w:sz w:val="19"/>
+                <w:szCs w:val="19"/>
+              </w:rPr>
+              <w:t xml:space="preserve">DGS</w:t>
+            </w:r>
+          </w:p>
+        </w:tc>
+        <w:tc>
+          <w:tcPr>
+            <w:tcW w:type="dxa" w:w="2482"/>
+            <w:tcBorders>
+              <w:top w:val="single" w:color="C9D3E3" w:sz="4"/>
+              <w:left w:val="single" w:color="C9D3E3" w:sz="4"/>
+              <w:bottom w:val="single" w:color="C9D3E3" w:sz="4"/>
+              <w:right w:val="single" w:color="C9D3E3" w:sz="4"/>
+            </w:tcBorders>
+            <w:tcMar>
+              <w:top w:type="dxa" w:w="70"/>
+              <w:left w:type="dxa" w:w="110"/>
+              <w:bottom w:type="dxa" w:w="70"/>
+              <w:right w:type="dxa" w:w="110"/>
+            </w:tcMar>
+            <w:vAlign w:val="center"/>
+          </w:tcPr>
+          <w:p>
+            <w:pPr>
+              <w:keepNext/>
+              <w:jc w:val="left"/>
+            </w:pPr>
+            <w:r>
+              <w:rPr>
+                <w:color w:val="111834"/>
+                <w:sz w:val="19"/>
+                <w:szCs w:val="19"/>
+              </w:rPr>
+              <w:t xml:space="preserve">60</w:t>
+            </w:r>
+          </w:p>
+        </w:tc>
+        <w:tc>
+          <w:tcPr>
+            <w:tcW w:type="dxa" w:w="4674"/>
+            <w:tcBorders>
+              <w:top w:val="single" w:color="C9D3E3" w:sz="4"/>
+              <w:left w:val="single" w:color="C9D3E3" w:sz="4"/>
+              <w:bottom w:val="single" w:color="C9D3E3" w:sz="4"/>
+              <w:right w:val="single" w:color="C9D3E3" w:sz="4"/>
+            </w:tcBorders>
+            <w:tcMar>
+              <w:top w:type="dxa" w:w="70"/>
+              <w:left w:type="dxa" w:w="110"/>
+              <w:bottom w:type="dxa" w:w="70"/>
+              <w:right w:type="dxa" w:w="110"/>
+            </w:tcMar>
+            <w:vAlign w:val="center"/>
+          </w:tcPr>
+          <w:p>
+            <w:pPr>
+              <w:keepNext/>
+              <w:jc w:val="left"/>
+            </w:pPr>
+            <w:r>
+              <w:rPr>
+                <w:color w:val="111834"/>
+                <w:sz w:val="19"/>
+                <w:szCs w:val="19"/>
+              </w:rPr>
+              <w:t xml:space="preserve">90 dk</w:t>
+            </w:r>
+          </w:p>
+        </w:tc>
+      </w:tr>
+      <w:tr>
+        <w:trPr>
+          <w:cantSplit/>
+        </w:trPr>
+        <w:tc>
+          <w:tcPr>
+            <w:tcW w:type="dxa" w:w="2482"/>
+            <w:tcBorders>
+              <w:top w:val="single" w:color="C9D3E3" w:sz="4"/>
+              <w:left w:val="single" w:color="C9D3E3" w:sz="4"/>
+              <w:bottom w:val="single" w:color="C9D3E3" w:sz="4"/>
+              <w:right w:val="single" w:color="C9D3E3" w:sz="4"/>
+            </w:tcBorders>
+            <w:tcMar>
+              <w:top w:type="dxa" w:w="70"/>
+              <w:left w:type="dxa" w:w="110"/>
+              <w:bottom w:type="dxa" w:w="70"/>
+              <w:right w:type="dxa" w:w="110"/>
+            </w:tcMar>
+            <w:vAlign w:val="center"/>
+          </w:tcPr>
+          <w:p>
+            <w:pPr>
+              <w:keepNext w:val="false"/>
+              <w:jc w:val="left"/>
+            </w:pPr>
+            <w:r>
+              <w:rPr>
+                <w:color w:val="111834"/>
+                <w:sz w:val="19"/>
+                <w:szCs w:val="19"/>
+              </w:rPr>
+              <w:t xml:space="preserve">ALES</w:t>
+            </w:r>
+          </w:p>
+        </w:tc>
+        <w:tc>
+          <w:tcPr>
+            <w:tcW w:type="dxa" w:w="2482"/>
+            <w:tcBorders>
+              <w:top w:val="single" w:color="C9D3E3" w:sz="4"/>
+              <w:left w:val="single" w:color="C9D3E3" w:sz="4"/>
+              <w:bottom w:val="single" w:color="C9D3E3" w:sz="4"/>
+              <w:right w:val="single" w:color="C9D3E3" w:sz="4"/>
+            </w:tcBorders>
+            <w:tcMar>
+              <w:top w:type="dxa" w:w="70"/>
+              <w:left w:type="dxa" w:w="110"/>
+              <w:bottom w:type="dxa" w:w="70"/>
+              <w:right w:type="dxa" w:w="110"/>
+            </w:tcMar>
+            <w:vAlign w:val="center"/>
+          </w:tcPr>
+          <w:p>
+            <w:pPr>
+              <w:keepNext w:val="false"/>
+              <w:jc w:val="left"/>
+            </w:pPr>
+            <w:r>
+              <w:rPr>
+                <w:color w:val="111834"/>
+                <w:sz w:val="19"/>
+                <w:szCs w:val="19"/>
+              </w:rPr>
+              <w:t xml:space="preserve">50</w:t>
+            </w:r>
+          </w:p>
+        </w:tc>
+        <w:tc>
+          <w:tcPr>
+            <w:tcW w:type="dxa" w:w="4674"/>
+            <w:tcBorders>
+              <w:top w:val="single" w:color="C9D3E3" w:sz="4"/>
+              <w:left w:val="single" w:color="C9D3E3" w:sz="4"/>
+              <w:bottom w:val="single" w:color="C9D3E3" w:sz="4"/>
+              <w:right w:val="single" w:color="C9D3E3" w:sz="4"/>
+            </w:tcBorders>
+            <w:tcMar>
+              <w:top w:type="dxa" w:w="70"/>
+              <w:left w:type="dxa" w:w="110"/>
+              <w:bottom w:type="dxa" w:w="70"/>
+              <w:right w:type="dxa" w:w="110"/>
+            </w:tcMar>
+            <w:vAlign w:val="center"/>
+          </w:tcPr>
+          <w:p>
+            <w:pPr>
+              <w:keepNext w:val="false"/>
+              <w:jc w:val="left"/>
+            </w:pPr>
+            <w:r>
+              <w:rPr>
+                <w:color w:val="111834"/>
+                <w:sz w:val="19"/>
+                <w:szCs w:val="19"/>
+              </w:rPr>
+              <w:t xml:space="preserve">75 dk</w:t>
+            </w:r>
+          </w:p>
+        </w:tc>
+      </w:tr>
+    </w:tbl>
+    <w:p>
+      <w:pPr>
+        <w:spacing w:after="160"/>
+      </w:pPr>
+    </w:p>
+    <w:tbl>
+      <w:tblPr>
+        <w:tblW w:type="dxa" w:w="9638"/>
+        <w:tblBorders>
+          <w:top w:val="single" w:color="auto" w:sz="4"/>
+          <w:left w:val="single" w:color="auto" w:sz="4"/>
+          <w:bottom w:val="single" w:color="auto" w:sz="4"/>
+          <w:right w:val="single" w:color="auto" w:sz="4"/>
+          <w:insideH w:val="single" w:color="auto" w:sz="4"/>
+          <w:insideV w:val="single" w:color="auto" w:sz="4"/>
+        </w:tblBorders>
+        <w:tblLayout w:type="fixed"/>
+      </w:tblPr>
+      <w:tblGrid>
+        <w:gridCol w:w="9638"/>
+      </w:tblGrid>
+      <w:tr>
+        <w:tc>
+          <w:tcPr>
+            <w:tcW w:type="dxa" w:w="9638"/>
+            <w:tcBorders>
+              <w:top w:val="single" w:color="D6E4F7" w:sz="6"/>
+              <w:left w:val="single" w:color="D6E4F7" w:sz="6"/>
+              <w:bottom w:val="single" w:color="D6E4F7" w:sz="6"/>
+              <w:right w:val="single" w:color="D6E4F7" w:sz="6"/>
+            </w:tcBorders>
+            <w:shd w:fill="F6F9FE" w:color="auto" w:val="clear"/>
+            <w:tcMar>
+              <w:top w:type="dxa" w:w="90"/>
+              <w:left w:type="dxa" w:w="140"/>
+              <w:bottom w:type="dxa" w:w="90"/>
+              <w:right w:type="dxa" w:w="140"/>
+            </w:tcMar>
+          </w:tcPr>
+          <w:p>
+            <w:pPr>
+              <w:spacing w:after="40"/>
+            </w:pPr>
+            <w:r>
+              <w:rPr>
+                <w:b/>
+                <w:bCs/>
+                <w:color w:val="1A5FB4"/>
+                <w:sz w:val="18"/>
+                <w:szCs w:val="18"/>
+              </w:rPr>
+              <w:t xml:space="preserve">Cevap</w:t>
+            </w:r>
+          </w:p>
+          <w:p>
+            <w:pPr>
+              <w:spacing w:after="60"/>
+            </w:pPr>
+            <w:r>
+              <w:t xml:space="preserve"/>
+            </w:r>
+          </w:p>
+          <w:p>
+            <w:pPr>
+              <w:spacing w:after="60"/>
+            </w:pPr>
+            <w:r>
+              <w:t xml:space="preserve"/>
+            </w:r>
+          </w:p>
+          <w:p>
+            <w:pPr>
+              <w:spacing w:after="60"/>
+            </w:pPr>
+            <w:r>
+              <w:t xml:space="preserve"/>
+            </w:r>
+          </w:p>
+        </w:tc>
+      </w:tr>
+    </w:tbl>
+    <w:p>
+      <w:pPr>
+        <w:spacing w:after="160"/>
+      </w:pPr>
+    </w:p>
+    <w:p>
+      <w:pPr>
+        <w:keepNext/>
+        <w:keepLines/>
+        <w:spacing w:after="100" w:before="200"/>
+      </w:pPr>
+      <w:r>
+        <w:rPr>
+          <w:b/>
+          <w:bCs/>
+          <w:color w:val="1A5FB4"/>
+        </w:rPr>
+        <w:t xml:space="preserve">Soru 12.2</w:t>
+      </w:r>
+      <w:r>
+        <w:t xml:space="preserve"> — Deneme, soruları gerçek sınavın konu dağılımına göre seçiyor ("gerçek sınavda bu konudan ortalama kaç soru çıkıyor"). Bu sayılar sizden gelmeli. Pilot sınavı için konu başına ortalama soru sayısını yazabilir misiniz?</w:t>
+      </w:r>
+    </w:p>
+    <w:tbl>
+      <w:tblPr>
+        <w:tblW w:type="dxa" w:w="9638"/>
+        <w:tblBorders>
+          <w:top w:val="single" w:color="auto" w:sz="4"/>
+          <w:left w:val="single" w:color="auto" w:sz="4"/>
+          <w:bottom w:val="single" w:color="auto" w:sz="4"/>
+          <w:right w:val="single" w:color="auto" w:sz="4"/>
+          <w:insideH w:val="single" w:color="auto" w:sz="4"/>
+          <w:insideV w:val="single" w:color="auto" w:sz="4"/>
+        </w:tblBorders>
+        <w:tblLayout w:type="fixed"/>
+      </w:tblPr>
+      <w:tblGrid>
+        <w:gridCol w:w="9638"/>
+      </w:tblGrid>
+      <w:tr>
+        <w:tc>
+          <w:tcPr>
+            <w:tcW w:type="dxa" w:w="9638"/>
+            <w:tcBorders>
+              <w:top w:val="single" w:color="D6E4F7" w:sz="6"/>
+              <w:left w:val="single" w:color="D6E4F7" w:sz="6"/>
+              <w:bottom w:val="single" w:color="D6E4F7" w:sz="6"/>
+              <w:right w:val="single" w:color="D6E4F7" w:sz="6"/>
+            </w:tcBorders>
+            <w:shd w:fill="F6F9FE" w:color="auto" w:val="clear"/>
+            <w:tcMar>
+              <w:top w:type="dxa" w:w="90"/>
+              <w:left w:type="dxa" w:w="140"/>
+              <w:bottom w:type="dxa" w:w="90"/>
+              <w:right w:type="dxa" w:w="140"/>
+            </w:tcMar>
+          </w:tcPr>
+          <w:p>
+            <w:pPr>
+              <w:spacing w:after="40"/>
+            </w:pPr>
+            <w:r>
+              <w:rPr>
+                <w:b/>
+                <w:bCs/>
+                <w:color w:val="1A5FB4"/>
+                <w:sz w:val="18"/>
+                <w:szCs w:val="18"/>
+              </w:rPr>
+              <w:t xml:space="preserve">Cevap</w:t>
+            </w:r>
+          </w:p>
+          <w:p>
+            <w:pPr>
+              <w:spacing w:after="60"/>
+            </w:pPr>
+            <w:r>
+              <w:t xml:space="preserve"/>
+            </w:r>
+          </w:p>
+          <w:p>
+            <w:pPr>
+              <w:spacing w:after="60"/>
+            </w:pPr>
+            <w:r>
+              <w:t xml:space="preserve"/>
+            </w:r>
+          </w:p>
+          <w:p>
+            <w:pPr>
+              <w:spacing w:after="60"/>
+            </w:pPr>
+            <w:r>
+              <w:t xml:space="preserve"/>
+            </w:r>
+          </w:p>
+        </w:tc>
+      </w:tr>
+    </w:tbl>
+    <w:p>
+      <w:pPr>
+        <w:spacing w:after="160"/>
+      </w:pPr>
+    </w:p>
+    <w:p>
+      <w:pPr>
+        <w:keepNext/>
+        <w:keepLines/>
+        <w:spacing w:after="100" w:before="200"/>
+      </w:pPr>
+      <w:r>
+        <w:rPr>
+          <w:b/>
+          <w:bCs/>
+          <w:color w:val="1A5FB4"/>
+        </w:rPr>
+        <w:t xml:space="preserve">Soru 12.3</w:t>
+      </w:r>
+      <w:r>
+        <w:t xml:space="preserve"> — Deneme sıklığı ve kuralları:</w:t>
+      </w:r>
+    </w:p>
+    <w:p>
+      <w:pPr>
+        <w:pStyle w:val="ListParagraph"/>
+        <w:keepNext/>
+        <w:numPr>
+          <w:ilvl w:val="0"/>
+          <w:numId w:val="2"/>
+        </w:numPr>
+        <w:spacing w:after="60"/>
+      </w:pPr>
+      <w:r>
+        <w:t xml:space="preserve">Ayda kaç deneme olsun?</w:t>
+      </w:r>
+    </w:p>
+    <w:p>
+      <w:pPr>
+        <w:pStyle w:val="ListParagraph"/>
+        <w:keepNext/>
+        <w:numPr>
+          <w:ilvl w:val="0"/>
+          <w:numId w:val="2"/>
+        </w:numPr>
+        <w:spacing w:after="60"/>
+      </w:pPr>
+      <w:r>
+        <w:t xml:space="preserve">Aynı deneme ikinci kez çözülebiliyor; karşılaştırmaya (yüzdelik dilim) yalnızca ilk deneme giriyor. Uygun mu?</w:t>
+      </w:r>
+    </w:p>
+    <w:p>
+      <w:pPr>
+        <w:pStyle w:val="ListParagraph"/>
+        <w:keepNext/>
+        <w:numPr>
+          <w:ilvl w:val="0"/>
+          <w:numId w:val="2"/>
+        </w:numPr>
+        <w:spacing w:after="60"/>
+      </w:pPr>
+      <w:r>
+        <w:t xml:space="preserve">Denemeler ücretsiz mi, ücretli mi?</w:t>
+      </w:r>
+    </w:p>
+    <w:p>
+      <w:pPr>
+        <w:pStyle w:val="ListParagraph"/>
+        <w:keepNext/>
+        <w:numPr>
+          <w:ilvl w:val="0"/>
+          <w:numId w:val="2"/>
+        </w:numPr>
+        <w:spacing w:after="60"/>
+      </w:pPr>
+      <w:r>
+        <w:t xml:space="preserve">Karşılaştırma ("netin, çözenlerin %Y'sinden yüksek") en az 10 kişi çözünce açılıyor. Eşik uygun mu?</w:t>
+      </w:r>
+    </w:p>
+    <w:p>
+      <w:pPr>
+        <w:pStyle w:val="ListParagraph"/>
+        <w:keepNext/>
+        <w:numPr>
+          <w:ilvl w:val="0"/>
+          <w:numId w:val="2"/>
+        </w:numPr>
+        <w:spacing w:after="60"/>
+      </w:pPr>
+      <w:r>
+        <w:t xml:space="preserve">Denemenin soruları şu an genel havuzda da duruyor: paket testlerinde, alıştırmada ve "Benzerini çöz"de çıkabiliyor. Denemeyi çözmemiş bir öğrenci soruyu önceden görebilir ve karşılaştırma bozulur. Deneme soruları genel havuzdan ayrılsın mı? Önerimiz ayrılması; o zaman denemeler için ayrıca soru yazmak gerekiyor.</w:t>
+      </w:r>
+    </w:p>
+    <w:p>
+      <w:pPr>
+        <w:pStyle w:val="ListParagraph"/>
+        <w:keepNext w:val="false"/>
+        <w:numPr>
+          <w:ilvl w:val="0"/>
+          <w:numId w:val="2"/>
+        </w:numPr>
+        <w:spacing w:after="60"/>
+      </w:pPr>
+      <w:r>
+        <w:t xml:space="preserve">Deneme doldurulurken zorluk 1-5'e eşit dağıtılıyor. Gerçek sınav gibi orta zorluk ağırlıklı mı olsun?</w:t>
+      </w:r>
+    </w:p>
+    <w:p>
+      <w:pPr>
+        <w:spacing w:after="60"/>
+      </w:pPr>
+    </w:p>
+    <w:tbl>
+      <w:tblPr>
+        <w:tblW w:type="dxa" w:w="9638"/>
+        <w:tblBorders>
+          <w:top w:val="single" w:color="auto" w:sz="4"/>
+          <w:left w:val="single" w:color="auto" w:sz="4"/>
+          <w:bottom w:val="single" w:color="auto" w:sz="4"/>
+          <w:right w:val="single" w:color="auto" w:sz="4"/>
+          <w:insideH w:val="single" w:color="auto" w:sz="4"/>
+          <w:insideV w:val="single" w:color="auto" w:sz="4"/>
+        </w:tblBorders>
+        <w:tblLayout w:type="fixed"/>
+      </w:tblPr>
+      <w:tblGrid>
+        <w:gridCol w:w="9638"/>
+      </w:tblGrid>
+      <w:tr>
+        <w:tc>
+          <w:tcPr>
+            <w:tcW w:type="dxa" w:w="9638"/>
+            <w:tcBorders>
+              <w:top w:val="single" w:color="D6E4F7" w:sz="6"/>
+              <w:left w:val="single" w:color="D6E4F7" w:sz="6"/>
+              <w:bottom w:val="single" w:color="D6E4F7" w:sz="6"/>
+              <w:right w:val="single" w:color="D6E4F7" w:sz="6"/>
+            </w:tcBorders>
+            <w:shd w:fill="F6F9FE" w:color="auto" w:val="clear"/>
+            <w:tcMar>
+              <w:top w:type="dxa" w:w="90"/>
+              <w:left w:type="dxa" w:w="140"/>
+              <w:bottom w:type="dxa" w:w="90"/>
+              <w:right w:type="dxa" w:w="140"/>
+            </w:tcMar>
+          </w:tcPr>
+          <w:p>
+            <w:pPr>
+              <w:spacing w:after="40"/>
+            </w:pPr>
+            <w:r>
+              <w:rPr>
+                <w:b/>
+                <w:bCs/>
+                <w:color w:val="1A5FB4"/>
+                <w:sz w:val="18"/>
+                <w:szCs w:val="18"/>
+              </w:rPr>
+              <w:t xml:space="preserve">Cevap</w:t>
+            </w:r>
+          </w:p>
+          <w:p>
+            <w:pPr>
+              <w:spacing w:after="60"/>
+            </w:pPr>
+            <w:r>
+              <w:t xml:space="preserve"/>
+            </w:r>
+          </w:p>
+          <w:p>
+            <w:pPr>
+              <w:spacing w:after="60"/>
+            </w:pPr>
+            <w:r>
+              <w:t xml:space="preserve"/>
+            </w:r>
+          </w:p>
+          <w:p>
+            <w:pPr>
+              <w:spacing w:after="60"/>
+            </w:pPr>
+            <w:r>
+              <w:t xml:space="preserve"/>
+            </w:r>
+          </w:p>
+        </w:tc>
+      </w:tr>
+    </w:tbl>
+    <w:p>
+      <w:pPr>
+        <w:spacing w:after="160"/>
+      </w:pPr>
+    </w:p>
+    <w:p>
+      <w:pPr>
+        <w:keepNext/>
+        <w:keepLines/>
+        <w:spacing w:after="100" w:before="200"/>
+      </w:pPr>
+      <w:r>
+        <w:rPr>
+          <w:b/>
+          <w:bCs/>
+          <w:color w:val="1A5FB4"/>
+        </w:rPr>
+        <w:t xml:space="preserve">Soru 12.4</w:t>
+      </w:r>
+      <w:r>
+        <w:t xml:space="preserve"> — Kâğıtta çözülen testlerde:</w:t>
+      </w:r>
+    </w:p>
+    <w:p>
+      <w:pPr>
+        <w:pStyle w:val="ListParagraph"/>
+        <w:keepNext/>
+        <w:numPr>
+          <w:ilvl w:val="0"/>
+          <w:numId w:val="2"/>
+        </w:numPr>
+        <w:spacing w:after="60"/>
+      </w:pPr>
+      <w:r>
+        <w:t xml:space="preserve">Öğrenci cevaplarını 48 saat içinde optik forma işlemeli.</w:t>
+      </w:r>
+    </w:p>
+    <w:p>
+      <w:pPr>
+        <w:pStyle w:val="ListParagraph"/>
+        <w:keepNext w:val="false"/>
+        <w:numPr>
+          <w:ilvl w:val="0"/>
+          <w:numId w:val="2"/>
+        </w:numPr>
+        <w:spacing w:after="60"/>
+      </w:pPr>
+      <w:r>
+        <w:t xml:space="preserve">Süre denetlenemediği için kâğıt denemeleri karşılaştırma havuzuna girmiyor; öğrenci yine de kendi yerini görüyor.</w:t>
+      </w:r>
+    </w:p>
+    <w:p>
+      <w:pPr>
+        <w:spacing w:after="60"/>
+      </w:pPr>
+    </w:p>
+    <w:p>
+      <w:pPr>
+        <w:keepNext/>
+        <w:spacing w:after="120"/>
+      </w:pPr>
+      <w:r>
+        <w:t xml:space="preserve">İkisi de uygun mu? Kitapçığın kurallar kutusuna "hesap makinesi kullanılmaz" gibi bir sınav kuralı eklensin mi?</w:t>
+      </w:r>
+    </w:p>
+    <w:tbl>
+      <w:tblPr>
+        <w:tblW w:type="dxa" w:w="9638"/>
+        <w:tblBorders>
+          <w:top w:val="single" w:color="auto" w:sz="4"/>
+          <w:left w:val="single" w:color="auto" w:sz="4"/>
+          <w:bottom w:val="single" w:color="auto" w:sz="4"/>
+          <w:right w:val="single" w:color="auto" w:sz="4"/>
+          <w:insideH w:val="single" w:color="auto" w:sz="4"/>
+          <w:insideV w:val="single" w:color="auto" w:sz="4"/>
+        </w:tblBorders>
+        <w:tblLayout w:type="fixed"/>
+      </w:tblPr>
+      <w:tblGrid>
+        <w:gridCol w:w="9638"/>
+      </w:tblGrid>
+      <w:tr>
+        <w:tc>
+          <w:tcPr>
+            <w:tcW w:type="dxa" w:w="9638"/>
+            <w:tcBorders>
+              <w:top w:val="single" w:color="D6E4F7" w:sz="6"/>
+              <w:left w:val="single" w:color="D6E4F7" w:sz="6"/>
+              <w:bottom w:val="single" w:color="D6E4F7" w:sz="6"/>
+              <w:right w:val="single" w:color="D6E4F7" w:sz="6"/>
+            </w:tcBorders>
+            <w:shd w:fill="F6F9FE" w:color="auto" w:val="clear"/>
+            <w:tcMar>
+              <w:top w:type="dxa" w:w="90"/>
+              <w:left w:type="dxa" w:w="140"/>
+              <w:bottom w:type="dxa" w:w="90"/>
+              <w:right w:type="dxa" w:w="140"/>
+            </w:tcMar>
+          </w:tcPr>
+          <w:p>
+            <w:pPr>
+              <w:spacing w:after="40"/>
+            </w:pPr>
+            <w:r>
+              <w:rPr>
+                <w:b/>
+                <w:bCs/>
+                <w:color w:val="1A5FB4"/>
+                <w:sz w:val="18"/>
+                <w:szCs w:val="18"/>
+              </w:rPr>
+              <w:t xml:space="preserve">Cevap</w:t>
+            </w:r>
+          </w:p>
+          <w:p>
+            <w:pPr>
+              <w:spacing w:after="60"/>
+            </w:pPr>
+            <w:r>
+              <w:t xml:space="preserve"/>
+            </w:r>
+          </w:p>
+          <w:p>
+            <w:pPr>
+              <w:spacing w:after="60"/>
+            </w:pPr>
+            <w:r>
+              <w:t xml:space="preserve"/>
+            </w:r>
+          </w:p>
+          <w:p>
+            <w:pPr>
+              <w:spacing w:after="60"/>
+            </w:pPr>
+            <w:r>
+              <w:t xml:space="preserve"/>
+            </w:r>
+          </w:p>
+        </w:tc>
+      </w:tr>
+    </w:tbl>
+    <w:p>
+      <w:pPr>
+        <w:spacing w:after="160"/>
+      </w:pPr>
+    </w:p>
+    <w:p>
+      <w:pPr>
+        <w:keepNext/>
+        <w:keepLines/>
+        <w:spacing w:after="100" w:before="200"/>
+      </w:pPr>
+      <w:r>
+        <w:rPr>
+          <w:b/>
+          <w:bCs/>
+          <w:color w:val="1A5FB4"/>
+        </w:rPr>
+        <w:t xml:space="preserve">Soru 12.5</w:t>
+      </w:r>
+      <w:r>
+        <w:t xml:space="preserve"> — İpucu yazım standardı. Önerimiz: soru başına en fazla 3 ipucu.</w:t>
+      </w:r>
+    </w:p>
+    <w:p>
+      <w:pPr>
+        <w:pStyle w:val="ListParagraph"/>
+        <w:keepNext/>
+        <w:numPr>
+          <w:ilvl w:val="0"/>
+          <w:numId w:val="2"/>
+        </w:numPr>
+        <w:spacing w:after="60"/>
+      </w:pPr>
+      <w:r>
+        <w:t xml:space="preserve">1. ipucu yön gösterir (hangi kavram, hangi formül).</w:t>
+      </w:r>
+    </w:p>
+    <w:p>
+      <w:pPr>
+        <w:pStyle w:val="ListParagraph"/>
+        <w:keepNext/>
+        <w:numPr>
+          <w:ilvl w:val="0"/>
+          <w:numId w:val="2"/>
+        </w:numPr>
+        <w:spacing w:after="60"/>
+      </w:pPr>
+      <w:r>
+        <w:t xml:space="preserve">2. ipucu ilk adımı kurar.</w:t>
+      </w:r>
+    </w:p>
+    <w:p>
+      <w:pPr>
+        <w:pStyle w:val="ListParagraph"/>
+        <w:keepNext w:val="false"/>
+        <w:numPr>
+          <w:ilvl w:val="0"/>
+          <w:numId w:val="2"/>
+        </w:numPr>
+        <w:spacing w:after="60"/>
+      </w:pPr>
+      <w:r>
+        <w:t xml:space="preserve">3. ipucu sonuca bir adım kala bırakır.</w:t>
+      </w:r>
+    </w:p>
+    <w:p>
+      <w:pPr>
+        <w:spacing w:after="60"/>
+      </w:pPr>
+    </w:p>
+    <w:p>
+      <w:pPr>
+        <w:keepNext/>
+        <w:spacing w:after="120"/>
+      </w:pPr>
+      <w:r>
+        <w:t xml:space="preserve">İpucuyla doğru yapılan soru, yanlış defterinde tam doğru sayılmıyor; ertesi gün yeniden geliyor (aşaması korunuyor). Uygun mu? İpucu her soruya mı yazılacak, yoksa yalnızca Seviye 1-2'ye mi? Bir ipucu en fazla 600 karakter; yeterli mi?</w:t>
+      </w:r>
+    </w:p>
+    <w:tbl>
+      <w:tblPr>
+        <w:tblW w:type="dxa" w:w="9638"/>
+        <w:tblBorders>
+          <w:top w:val="single" w:color="auto" w:sz="4"/>
+          <w:left w:val="single" w:color="auto" w:sz="4"/>
+          <w:bottom w:val="single" w:color="auto" w:sz="4"/>
+          <w:right w:val="single" w:color="auto" w:sz="4"/>
+          <w:insideH w:val="single" w:color="auto" w:sz="4"/>
+          <w:insideV w:val="single" w:color="auto" w:sz="4"/>
+        </w:tblBorders>
+        <w:tblLayout w:type="fixed"/>
+      </w:tblPr>
+      <w:tblGrid>
+        <w:gridCol w:w="9638"/>
+      </w:tblGrid>
+      <w:tr>
+        <w:tc>
+          <w:tcPr>
+            <w:tcW w:type="dxa" w:w="9638"/>
+            <w:tcBorders>
+              <w:top w:val="single" w:color="D6E4F7" w:sz="6"/>
+              <w:left w:val="single" w:color="D6E4F7" w:sz="6"/>
+              <w:bottom w:val="single" w:color="D6E4F7" w:sz="6"/>
+              <w:right w:val="single" w:color="D6E4F7" w:sz="6"/>
+            </w:tcBorders>
+            <w:shd w:fill="F6F9FE" w:color="auto" w:val="clear"/>
+            <w:tcMar>
+              <w:top w:type="dxa" w:w="90"/>
+              <w:left w:type="dxa" w:w="140"/>
+              <w:bottom w:type="dxa" w:w="90"/>
+              <w:right w:type="dxa" w:w="140"/>
+            </w:tcMar>
+          </w:tcPr>
+          <w:p>
+            <w:pPr>
+              <w:spacing w:after="40"/>
+            </w:pPr>
+            <w:r>
+              <w:rPr>
+                <w:b/>
+                <w:bCs/>
+                <w:color w:val="1A5FB4"/>
+                <w:sz w:val="18"/>
+                <w:szCs w:val="18"/>
+              </w:rPr>
+              <w:t xml:space="preserve">Cevap</w:t>
+            </w:r>
+          </w:p>
+          <w:p>
+            <w:pPr>
+              <w:spacing w:after="60"/>
+            </w:pPr>
+            <w:r>
+              <w:t xml:space="preserve"/>
+            </w:r>
+          </w:p>
+          <w:p>
+            <w:pPr>
+              <w:spacing w:after="60"/>
+            </w:pPr>
+            <w:r>
+              <w:t xml:space="preserve"/>
+            </w:r>
+          </w:p>
+          <w:p>
+            <w:pPr>
+              <w:spacing w:after="60"/>
+            </w:pPr>
+            <w:r>
+              <w:t xml:space="preserve"/>
+            </w:r>
+          </w:p>
+        </w:tc>
+      </w:tr>
+    </w:tbl>
+    <w:p>
+      <w:pPr>
+        <w:spacing w:after="160"/>
+      </w:pPr>
+    </w:p>
+    <w:p>
+      <w:pPr>
+        <w:keepNext/>
+        <w:keepLines/>
+        <w:spacing w:after="100" w:before="200"/>
+      </w:pPr>
+      <w:r>
+        <w:rPr>
+          <w:b/>
+          <w:bCs/>
+          <w:color w:val="1A5FB4"/>
+        </w:rPr>
+        <w:t xml:space="preserve">Soru 12.6</w:t>
+      </w:r>
+      <w:r>
+        <w:t xml:space="preserve"> — Adım adım çözüm: çözümdeki adımlar tek başına bir </w:t>
+      </w:r>
+      <w:r>
+        <w:rPr>
+          <w:rFonts w:ascii="Consolas" w:cs="Consolas" w:eastAsia="Consolas" w:hAnsi="Consolas"/>
+          <w:color w:val="17305E"/>
+          <w:sz w:val="20"/>
+          <w:szCs w:val="20"/>
+        </w:rPr>
+        <w:t xml:space="preserve">---</w:t>
+      </w:r>
+      <w:r>
+        <w:t xml:space="preserve"> satırıyla ayrılıyor; öğrenci adımları tek tek açıyor. Ekip için önerilen adım sayısı 2-5. Uygun mu?</w:t>
+      </w:r>
+    </w:p>
+    <w:tbl>
+      <w:tblPr>
+        <w:tblW w:type="dxa" w:w="9638"/>
+        <w:tblBorders>
+          <w:top w:val="single" w:color="auto" w:sz="4"/>
+          <w:left w:val="single" w:color="auto" w:sz="4"/>
+          <w:bottom w:val="single" w:color="auto" w:sz="4"/>
+          <w:right w:val="single" w:color="auto" w:sz="4"/>
+          <w:insideH w:val="single" w:color="auto" w:sz="4"/>
+          <w:insideV w:val="single" w:color="auto" w:sz="4"/>
+        </w:tblBorders>
+        <w:tblLayout w:type="fixed"/>
+      </w:tblPr>
+      <w:tblGrid>
+        <w:gridCol w:w="9638"/>
+      </w:tblGrid>
+      <w:tr>
+        <w:tc>
+          <w:tcPr>
+            <w:tcW w:type="dxa" w:w="9638"/>
+            <w:tcBorders>
+              <w:top w:val="single" w:color="D6E4F7" w:sz="6"/>
+              <w:left w:val="single" w:color="D6E4F7" w:sz="6"/>
+              <w:bottom w:val="single" w:color="D6E4F7" w:sz="6"/>
+              <w:right w:val="single" w:color="D6E4F7" w:sz="6"/>
+            </w:tcBorders>
+            <w:shd w:fill="F6F9FE" w:color="auto" w:val="clear"/>
+            <w:tcMar>
+              <w:top w:type="dxa" w:w="90"/>
+              <w:left w:type="dxa" w:w="140"/>
+              <w:bottom w:type="dxa" w:w="90"/>
+              <w:right w:type="dxa" w:w="140"/>
+            </w:tcMar>
+          </w:tcPr>
+          <w:p>
+            <w:pPr>
+              <w:spacing w:after="40"/>
+            </w:pPr>
+            <w:r>
+              <w:rPr>
+                <w:b/>
+                <w:bCs/>
+                <w:color w:val="1A5FB4"/>
+                <w:sz w:val="18"/>
+                <w:szCs w:val="18"/>
+              </w:rPr>
+              <w:t xml:space="preserve">Cevap</w:t>
+            </w:r>
+          </w:p>
+          <w:p>
+            <w:pPr>
+              <w:spacing w:after="60"/>
+            </w:pPr>
+            <w:r>
+              <w:t xml:space="preserve"/>
+            </w:r>
+          </w:p>
+          <w:p>
+            <w:pPr>
+              <w:spacing w:after="60"/>
+            </w:pPr>
+            <w:r>
+              <w:t xml:space="preserve"/>
+            </w:r>
+          </w:p>
+          <w:p>
+            <w:pPr>
+              <w:spacing w:after="60"/>
+            </w:pPr>
+            <w:r>
+              <w:t xml:space="preserve"/>
+            </w:r>
+          </w:p>
+        </w:tc>
+      </w:tr>
+    </w:tbl>
+    <w:p>
+      <w:pPr>
+        <w:spacing w:after="160"/>
+      </w:pPr>
+    </w:p>
+    <w:p>
+      <w:pPr>
+        <w:keepNext/>
+        <w:keepLines/>
+        <w:spacing w:after="100" w:before="200"/>
+      </w:pPr>
+      <w:r>
+        <w:rPr>
+          <w:b/>
+          <w:bCs/>
+          <w:color w:val="1A5FB4"/>
+        </w:rPr>
+        <w:t xml:space="preserve">Soru 12.7</w:t>
+      </w:r>
+      <w:r>
+        <w:t xml:space="preserve"> — Video çözüm: soruya YouTube ("liste dışı") ya da Vimeo bağlantısı eklenebiliyor.</w:t>
+      </w:r>
+    </w:p>
+    <w:p>
+      <w:pPr>
+        <w:pStyle w:val="ListParagraph"/>
+        <w:keepNext/>
+        <w:numPr>
+          <w:ilvl w:val="0"/>
+          <w:numId w:val="2"/>
+        </w:numPr>
+        <w:spacing w:after="60"/>
+      </w:pPr>
+      <w:r>
+        <w:t xml:space="preserve">Videoları kim çekecek?</w:t>
+      </w:r>
+    </w:p>
+    <w:p>
+      <w:pPr>
+        <w:pStyle w:val="ListParagraph"/>
+        <w:keepNext/>
+        <w:numPr>
+          <w:ilvl w:val="0"/>
+          <w:numId w:val="2"/>
+        </w:numPr>
+        <w:spacing w:after="60"/>
+      </w:pPr>
+      <w:r>
+        <w:t xml:space="preserve">Hangi sorular için: zor sorular mı, her kazanımdan bir örnek mi?</w:t>
+      </w:r>
+    </w:p>
+    <w:p>
+      <w:pPr>
+        <w:pStyle w:val="ListParagraph"/>
+        <w:keepNext w:val="false"/>
+        <w:numPr>
+          <w:ilvl w:val="0"/>
+          <w:numId w:val="2"/>
+        </w:numPr>
+        <w:spacing w:after="60"/>
+      </w:pPr>
+      <w:r>
+        <w:t xml:space="preserve">Kanal hesabı kimde olacak?</w:t>
+      </w:r>
+    </w:p>
+    <w:p>
+      <w:pPr>
+        <w:spacing w:after="60"/>
+      </w:pPr>
+    </w:p>
+    <w:tbl>
+      <w:tblPr>
+        <w:tblW w:type="dxa" w:w="9638"/>
+        <w:tblBorders>
+          <w:top w:val="single" w:color="auto" w:sz="4"/>
+          <w:left w:val="single" w:color="auto" w:sz="4"/>
+          <w:bottom w:val="single" w:color="auto" w:sz="4"/>
+          <w:right w:val="single" w:color="auto" w:sz="4"/>
+          <w:insideH w:val="single" w:color="auto" w:sz="4"/>
+          <w:insideV w:val="single" w:color="auto" w:sz="4"/>
+        </w:tblBorders>
+        <w:tblLayout w:type="fixed"/>
+      </w:tblPr>
+      <w:tblGrid>
+        <w:gridCol w:w="9638"/>
+      </w:tblGrid>
+      <w:tr>
+        <w:tc>
+          <w:tcPr>
+            <w:tcW w:type="dxa" w:w="9638"/>
+            <w:tcBorders>
+              <w:top w:val="single" w:color="D6E4F7" w:sz="6"/>
+              <w:left w:val="single" w:color="D6E4F7" w:sz="6"/>
+              <w:bottom w:val="single" w:color="D6E4F7" w:sz="6"/>
+              <w:right w:val="single" w:color="D6E4F7" w:sz="6"/>
+            </w:tcBorders>
+            <w:shd w:fill="F6F9FE" w:color="auto" w:val="clear"/>
+            <w:tcMar>
+              <w:top w:type="dxa" w:w="90"/>
+              <w:left w:type="dxa" w:w="140"/>
+              <w:bottom w:type="dxa" w:w="90"/>
+              <w:right w:type="dxa" w:w="140"/>
+            </w:tcMar>
+          </w:tcPr>
+          <w:p>
+            <w:pPr>
+              <w:spacing w:after="40"/>
+            </w:pPr>
+            <w:r>
+              <w:rPr>
+                <w:b/>
+                <w:bCs/>
+                <w:color w:val="1A5FB4"/>
+                <w:sz w:val="18"/>
+                <w:szCs w:val="18"/>
+              </w:rPr>
+              <w:t xml:space="preserve">Cevap</w:t>
+            </w:r>
+          </w:p>
+          <w:p>
+            <w:pPr>
+              <w:spacing w:after="60"/>
+            </w:pPr>
+            <w:r>
+              <w:t xml:space="preserve"/>
+            </w:r>
+          </w:p>
+          <w:p>
+            <w:pPr>
+              <w:spacing w:after="60"/>
+            </w:pPr>
+            <w:r>
+              <w:t xml:space="preserve"/>
+            </w:r>
+          </w:p>
+          <w:p>
+            <w:pPr>
+              <w:spacing w:after="60"/>
+            </w:pPr>
+            <w:r>
+              <w:t xml:space="preserve"/>
+            </w:r>
+          </w:p>
+        </w:tc>
+      </w:tr>
+    </w:tbl>
+    <w:p>
+      <w:pPr>
+        <w:spacing w:after="160"/>
+      </w:pPr>
+    </w:p>
+    <w:p>
+      <w:pPr>
+        <w:keepNext/>
+        <w:keepLines/>
+        <w:spacing w:after="100" w:before="200"/>
+      </w:pPr>
+      <w:r>
+        <w:rPr>
+          <w:b/>
+          <w:bCs/>
+          <w:color w:val="1A5FB4"/>
+        </w:rPr>
+        <w:t xml:space="preserve">Soru 12.8</w:t>
+      </w:r>
+      <w:r>
+        <w:t xml:space="preserve"> — Kazanım özet kartı: her kazanım için 3-5 satırlık özet ve formüller; öğrenci o kazanımda yanlış yaptığında görüyor. Kartları kim yazacak? Kazanım listesiyle (Bölüm 4) birlikte hazırlanabilir mi? Kart en fazla 1200 karakter; önerdiğimiz düzen: kural, formül, kısa örnek. Uygun mu?</w:t>
+      </w:r>
+    </w:p>
+    <w:tbl>
+      <w:tblPr>
+        <w:tblW w:type="dxa" w:w="9638"/>
+        <w:tblBorders>
+          <w:top w:val="single" w:color="auto" w:sz="4"/>
+          <w:left w:val="single" w:color="auto" w:sz="4"/>
+          <w:bottom w:val="single" w:color="auto" w:sz="4"/>
+          <w:right w:val="single" w:color="auto" w:sz="4"/>
+          <w:insideH w:val="single" w:color="auto" w:sz="4"/>
+          <w:insideV w:val="single" w:color="auto" w:sz="4"/>
+        </w:tblBorders>
+        <w:tblLayout w:type="fixed"/>
+      </w:tblPr>
+      <w:tblGrid>
+        <w:gridCol w:w="9638"/>
+      </w:tblGrid>
+      <w:tr>
+        <w:tc>
+          <w:tcPr>
+            <w:tcW w:type="dxa" w:w="9638"/>
+            <w:tcBorders>
+              <w:top w:val="single" w:color="D6E4F7" w:sz="6"/>
+              <w:left w:val="single" w:color="D6E4F7" w:sz="6"/>
+              <w:bottom w:val="single" w:color="D6E4F7" w:sz="6"/>
+              <w:right w:val="single" w:color="D6E4F7" w:sz="6"/>
+            </w:tcBorders>
+            <w:shd w:fill="F6F9FE" w:color="auto" w:val="clear"/>
+            <w:tcMar>
+              <w:top w:type="dxa" w:w="90"/>
+              <w:left w:type="dxa" w:w="140"/>
+              <w:bottom w:type="dxa" w:w="90"/>
+              <w:right w:type="dxa" w:w="140"/>
+            </w:tcMar>
+          </w:tcPr>
+          <w:p>
+            <w:pPr>
+              <w:spacing w:after="40"/>
+            </w:pPr>
+            <w:r>
+              <w:rPr>
+                <w:b/>
+                <w:bCs/>
+                <w:color w:val="1A5FB4"/>
+                <w:sz w:val="18"/>
+                <w:szCs w:val="18"/>
+              </w:rPr>
+              <w:t xml:space="preserve">Cevap</w:t>
+            </w:r>
+          </w:p>
+          <w:p>
+            <w:pPr>
+              <w:spacing w:after="60"/>
+            </w:pPr>
+            <w:r>
+              <w:t xml:space="preserve"/>
+            </w:r>
+          </w:p>
+          <w:p>
+            <w:pPr>
+              <w:spacing w:after="60"/>
+            </w:pPr>
+            <w:r>
+              <w:t xml:space="preserve"/>
+            </w:r>
+          </w:p>
+          <w:p>
+            <w:pPr>
+              <w:spacing w:after="60"/>
+            </w:pPr>
+            <w:r>
+              <w:t xml:space="preserve"/>
+            </w:r>
+          </w:p>
+        </w:tc>
+      </w:tr>
+    </w:tbl>
+    <w:p>
+      <w:pPr>
+        <w:spacing w:after="160"/>
+      </w:pPr>
+    </w:p>
+    <w:p>
+      <w:pPr>
+        <w:keepNext/>
+        <w:keepLines/>
+        <w:spacing w:after="100" w:before="200"/>
+      </w:pPr>
+      <w:r>
+        <w:rPr>
+          <w:b/>
+          <w:bCs/>
+          <w:color w:val="1A5FB4"/>
+        </w:rPr>
+        <w:t xml:space="preserve">Soru 12.9</w:t>
+      </w:r>
+      <w:r>
+        <w:t xml:space="preserve"> — Öğrenciler sorularda "bu soruda hata var" diyebiliyor (yanlış anahtar, hatalı çözüm, yazım, görsel). Bildirimler panelde ayrı bir listede. Kim bakacak ve en geç kaç gün içinde?</w:t>
+      </w:r>
+    </w:p>
+    <w:tbl>
+      <w:tblPr>
+        <w:tblW w:type="dxa" w:w="9638"/>
+        <w:tblBorders>
+          <w:top w:val="single" w:color="auto" w:sz="4"/>
+          <w:left w:val="single" w:color="auto" w:sz="4"/>
+          <w:bottom w:val="single" w:color="auto" w:sz="4"/>
+          <w:right w:val="single" w:color="auto" w:sz="4"/>
+          <w:insideH w:val="single" w:color="auto" w:sz="4"/>
+          <w:insideV w:val="single" w:color="auto" w:sz="4"/>
+        </w:tblBorders>
+        <w:tblLayout w:type="fixed"/>
+      </w:tblPr>
+      <w:tblGrid>
+        <w:gridCol w:w="9638"/>
+      </w:tblGrid>
+      <w:tr>
+        <w:tc>
+          <w:tcPr>
+            <w:tcW w:type="dxa" w:w="9638"/>
+            <w:tcBorders>
+              <w:top w:val="single" w:color="D6E4F7" w:sz="6"/>
+              <w:left w:val="single" w:color="D6E4F7" w:sz="6"/>
+              <w:bottom w:val="single" w:color="D6E4F7" w:sz="6"/>
+              <w:right w:val="single" w:color="D6E4F7" w:sz="6"/>
+            </w:tcBorders>
+            <w:shd w:fill="F6F9FE" w:color="auto" w:val="clear"/>
+            <w:tcMar>
+              <w:top w:type="dxa" w:w="90"/>
+              <w:left w:type="dxa" w:w="140"/>
+              <w:bottom w:type="dxa" w:w="90"/>
+              <w:right w:type="dxa" w:w="140"/>
+            </w:tcMar>
+          </w:tcPr>
+          <w:p>
+            <w:pPr>
+              <w:spacing w:after="40"/>
+            </w:pPr>
+            <w:r>
+              <w:rPr>
+                <w:b/>
+                <w:bCs/>
+                <w:color w:val="1A5FB4"/>
+                <w:sz w:val="18"/>
+                <w:szCs w:val="18"/>
+              </w:rPr>
+              <w:t xml:space="preserve">Cevap</w:t>
+            </w:r>
+          </w:p>
+          <w:p>
+            <w:pPr>
+              <w:spacing w:after="60"/>
+            </w:pPr>
+            <w:r>
+              <w:t xml:space="preserve"/>
+            </w:r>
+          </w:p>
+          <w:p>
+            <w:pPr>
+              <w:spacing w:after="60"/>
+            </w:pPr>
+            <w:r>
+              <w:t xml:space="preserve"/>
+            </w:r>
+          </w:p>
+          <w:p>
+            <w:pPr>
+              <w:spacing w:after="60"/>
+            </w:pPr>
+            <w:r>
+              <w:t xml:space="preserve"/>
+            </w:r>
+          </w:p>
+        </w:tc>
+      </w:tr>
+    </w:tbl>
+    <w:p>
+      <w:pPr>
+        <w:spacing w:after="160"/>
+      </w:pPr>
+    </w:p>
+    <w:p>
+      <w:pPr>
+        <w:keepNext/>
+        <w:keepLines/>
+        <w:spacing w:after="100" w:before="200"/>
+      </w:pPr>
+      <w:r>
+        <w:rPr>
+          <w:b/>
+          <w:bCs/>
+          <w:color w:val="1A5FB4"/>
+        </w:rPr>
+        <w:t xml:space="preserve">Soru 12.10</w:t>
+      </w:r>
+      <w:r>
+        <w:t xml:space="preserve"> — "Koça sor": öğrenci bir soru hakkında ya da genel bir konuda koça yazabiliyor (günde en fazla 5; aynı anda en fazla 3 cevapsız soru).</w:t>
+      </w:r>
+    </w:p>
+    <w:p>
+      <w:pPr>
+        <w:pStyle w:val="ListParagraph"/>
+        <w:keepNext/>
+        <w:numPr>
+          <w:ilvl w:val="0"/>
+          <w:numId w:val="2"/>
+        </w:numPr>
+        <w:spacing w:after="60"/>
+      </w:pPr>
+      <w:r>
+        <w:t xml:space="preserve">Cevapları kim verecek?</w:t>
+      </w:r>
+    </w:p>
+    <w:p>
+      <w:pPr>
+        <w:pStyle w:val="ListParagraph"/>
+        <w:keepNext w:val="false"/>
+        <w:numPr>
+          <w:ilvl w:val="0"/>
+          <w:numId w:val="2"/>
+        </w:numPr>
+        <w:spacing w:after="60"/>
+      </w:pPr>
+      <w:r>
+        <w:t xml:space="preserve">Hedef cevap süresi ne olsun (ör. 24 saat)?</w:t>
+      </w:r>
+    </w:p>
+    <w:p>
+      <w:pPr>
+        <w:spacing w:after="60"/>
+      </w:pPr>
+    </w:p>
+    <w:tbl>
+      <w:tblPr>
+        <w:tblW w:type="dxa" w:w="9638"/>
+        <w:tblBorders>
+          <w:top w:val="single" w:color="auto" w:sz="4"/>
+          <w:left w:val="single" w:color="auto" w:sz="4"/>
+          <w:bottom w:val="single" w:color="auto" w:sz="4"/>
+          <w:right w:val="single" w:color="auto" w:sz="4"/>
+          <w:insideH w:val="single" w:color="auto" w:sz="4"/>
+          <w:insideV w:val="single" w:color="auto" w:sz="4"/>
+        </w:tblBorders>
+        <w:tblLayout w:type="fixed"/>
+      </w:tblPr>
+      <w:tblGrid>
+        <w:gridCol w:w="9638"/>
+      </w:tblGrid>
+      <w:tr>
+        <w:tc>
+          <w:tcPr>
+            <w:tcW w:type="dxa" w:w="9638"/>
+            <w:tcBorders>
+              <w:top w:val="single" w:color="D6E4F7" w:sz="6"/>
+              <w:left w:val="single" w:color="D6E4F7" w:sz="6"/>
+              <w:bottom w:val="single" w:color="D6E4F7" w:sz="6"/>
+              <w:right w:val="single" w:color="D6E4F7" w:sz="6"/>
+            </w:tcBorders>
+            <w:shd w:fill="F6F9FE" w:color="auto" w:val="clear"/>
+            <w:tcMar>
+              <w:top w:type="dxa" w:w="90"/>
+              <w:left w:type="dxa" w:w="140"/>
+              <w:bottom w:type="dxa" w:w="90"/>
+              <w:right w:type="dxa" w:w="140"/>
+            </w:tcMar>
+          </w:tcPr>
+          <w:p>
+            <w:pPr>
+              <w:spacing w:after="40"/>
+            </w:pPr>
+            <w:r>
+              <w:rPr>
+                <w:b/>
+                <w:bCs/>
+                <w:color w:val="1A5FB4"/>
+                <w:sz w:val="18"/>
+                <w:szCs w:val="18"/>
+              </w:rPr>
+              <w:t xml:space="preserve">Cevap</w:t>
+            </w:r>
+          </w:p>
+          <w:p>
+            <w:pPr>
+              <w:spacing w:after="60"/>
+            </w:pPr>
+            <w:r>
+              <w:t xml:space="preserve"/>
+            </w:r>
+          </w:p>
+          <w:p>
+            <w:pPr>
+              <w:spacing w:after="60"/>
+            </w:pPr>
+            <w:r>
+              <w:t xml:space="preserve"/>
+            </w:r>
+          </w:p>
+          <w:p>
+            <w:pPr>
+              <w:spacing w:after="60"/>
+            </w:pPr>
+            <w:r>
+              <w:t xml:space="preserve"/>
+            </w:r>
+          </w:p>
+        </w:tc>
+      </w:tr>
+    </w:tbl>
+    <w:p>
+      <w:pPr>
+        <w:spacing w:after="160"/>
+      </w:pPr>
+    </w:p>
+    <w:p>
+      <w:pPr>
+        <w:keepNext/>
+        <w:keepLines/>
+        <w:spacing w:after="100" w:before="200"/>
+      </w:pPr>
+      <w:r>
+        <w:rPr>
+          <w:b/>
+          <w:bCs/>
+          <w:color w:val="1A5FB4"/>
+        </w:rPr>
+        <w:t xml:space="preserve">Soru 12.11</w:t>
+      </w:r>
+      <w:r>
+        <w:t xml:space="preserve"> — Grup ve ödev: koç panelde grup kurup ödev veriyor (bir paket/deneme çözmek ya da bir konudan en az N soru alıştırma). Tamamlanma sistemden okunuyor, öğrencinin "yaptım" demesi yetmiyor.</w:t>
+      </w:r>
+    </w:p>
+    <w:p>
+      <w:pPr>
+        <w:pStyle w:val="ListParagraph"/>
+        <w:keepNext/>
+        <w:numPr>
+          <w:ilvl w:val="0"/>
+          <w:numId w:val="2"/>
+        </w:numPr>
+        <w:spacing w:after="60"/>
+      </w:pPr>
+      <w:r>
+        <w:t xml:space="preserve">Pilot grubunda haftada kaç ödev planlıyorsunuz?</w:t>
+      </w:r>
+    </w:p>
+    <w:p>
+      <w:pPr>
+        <w:pStyle w:val="ListParagraph"/>
+        <w:keepNext/>
+        <w:numPr>
+          <w:ilvl w:val="0"/>
+          <w:numId w:val="2"/>
+        </w:numPr>
+        <w:spacing w:after="60"/>
+      </w:pPr>
+      <w:r>
+        <w:t xml:space="preserve">Başka bir ödev türü lazım mı (ör. yanlış defteri tekrarı, seviyeli check-up)?</w:t>
+      </w:r>
+    </w:p>
+    <w:p>
+      <w:pPr>
+        <w:pStyle w:val="ListParagraph"/>
+        <w:keepNext w:val="false"/>
+        <w:numPr>
+          <w:ilvl w:val="0"/>
+          <w:numId w:val="2"/>
+        </w:numPr>
+        <w:spacing w:after="60"/>
+      </w:pPr>
+      <w:r>
+        <w:t xml:space="preserve">Konu ödevinde öğrencinin "Bilmiyorum" deyip geçtiği soru da ödeve sayılıyor (saymasak rastgele işaretleyen ödüllenir). Son tarihten sonra bitirilen ödev "geç tamamlandı" diye işaretleniyor ama tamamlanmış sayılıyor. İkisi de uygun mu?</w:t>
+      </w:r>
+    </w:p>
+    <w:p>
+      <w:pPr>
+        <w:spacing w:after="60"/>
+      </w:pPr>
+    </w:p>
+    <w:tbl>
+      <w:tblPr>
+        <w:tblW w:type="dxa" w:w="9638"/>
+        <w:tblBorders>
+          <w:top w:val="single" w:color="auto" w:sz="4"/>
+          <w:left w:val="single" w:color="auto" w:sz="4"/>
+          <w:bottom w:val="single" w:color="auto" w:sz="4"/>
+          <w:right w:val="single" w:color="auto" w:sz="4"/>
+          <w:insideH w:val="single" w:color="auto" w:sz="4"/>
+          <w:insideV w:val="single" w:color="auto" w:sz="4"/>
+        </w:tblBorders>
+        <w:tblLayout w:type="fixed"/>
+      </w:tblPr>
+      <w:tblGrid>
+        <w:gridCol w:w="9638"/>
+      </w:tblGrid>
+      <w:tr>
+        <w:tc>
+          <w:tcPr>
+            <w:tcW w:type="dxa" w:w="9638"/>
+            <w:tcBorders>
+              <w:top w:val="single" w:color="D6E4F7" w:sz="6"/>
+              <w:left w:val="single" w:color="D6E4F7" w:sz="6"/>
+              <w:bottom w:val="single" w:color="D6E4F7" w:sz="6"/>
+              <w:right w:val="single" w:color="D6E4F7" w:sz="6"/>
+            </w:tcBorders>
+            <w:shd w:fill="F6F9FE" w:color="auto" w:val="clear"/>
+            <w:tcMar>
+              <w:top w:type="dxa" w:w="90"/>
+              <w:left w:type="dxa" w:w="140"/>
+              <w:bottom w:type="dxa" w:w="90"/>
+              <w:right w:type="dxa" w:w="140"/>
+            </w:tcMar>
+          </w:tcPr>
+          <w:p>
+            <w:pPr>
+              <w:spacing w:after="40"/>
+            </w:pPr>
+            <w:r>
+              <w:rPr>
+                <w:b/>
+                <w:bCs/>
+                <w:color w:val="1A5FB4"/>
+                <w:sz w:val="18"/>
+                <w:szCs w:val="18"/>
+              </w:rPr>
+              <w:t xml:space="preserve">Cevap</w:t>
+            </w:r>
+          </w:p>
+          <w:p>
+            <w:pPr>
+              <w:spacing w:after="60"/>
+            </w:pPr>
+            <w:r>
+              <w:t xml:space="preserve"/>
+            </w:r>
+          </w:p>
+          <w:p>
+            <w:pPr>
+              <w:spacing w:after="60"/>
+            </w:pPr>
+            <w:r>
+              <w:t xml:space="preserve"/>
+            </w:r>
+          </w:p>
+          <w:p>
+            <w:pPr>
+              <w:spacing w:after="60"/>
+            </w:pPr>
+            <w:r>
+              <w:t xml:space="preserve"/>
+            </w:r>
+          </w:p>
+        </w:tc>
+      </w:tr>
+    </w:tbl>
+    <w:p>
+      <w:pPr>
+        <w:spacing w:after="160"/>
+      </w:pPr>
+    </w:p>
+    <w:p>
+      <w:pPr>
+        <w:keepNext/>
+        <w:keepLines/>
+        <w:spacing w:after="100" w:before="200"/>
+      </w:pPr>
+      <w:r>
+        <w:rPr>
+          <w:b/>
+          <w:bCs/>
+          <w:color w:val="1A5FB4"/>
+        </w:rPr>
+        <w:t xml:space="preserve">Soru 12.12</w:t>
+      </w:r>
+      <w:r>
+        <w:t xml:space="preserve"> — Seri ve günlük hedef:</w:t>
+      </w:r>
+    </w:p>
+    <w:p>
+      <w:pPr>
+        <w:pStyle w:val="ListParagraph"/>
+        <w:keepNext/>
+        <w:numPr>
+          <w:ilvl w:val="0"/>
+          <w:numId w:val="2"/>
+        </w:numPr>
+        <w:spacing w:after="60"/>
+      </w:pPr>
+      <w:r>
+        <w:t xml:space="preserve">En az bir soru çözülen her gün seriyi sürdürüyor.</w:t>
+      </w:r>
+    </w:p>
+    <w:p>
+      <w:pPr>
+        <w:pStyle w:val="ListParagraph"/>
+        <w:keepNext w:val="false"/>
+        <w:numPr>
+          <w:ilvl w:val="0"/>
+          <w:numId w:val="2"/>
+        </w:numPr>
+        <w:spacing w:after="60"/>
+      </w:pPr>
+      <w:r>
+        <w:t xml:space="preserve">Günlük hedef varsayılan 10 soru; öğrenci profilden değiştirebiliyor.</w:t>
+      </w:r>
+    </w:p>
+    <w:p>
+      <w:pPr>
+        <w:spacing w:after="60"/>
+      </w:pPr>
+    </w:p>
+    <w:p>
+      <w:pPr>
+        <w:keepNext/>
+        <w:spacing w:after="120"/>
+      </w:pPr>
+      <w:r>
+        <w:t xml:space="preserve">Uygun mu?</w:t>
+      </w:r>
+    </w:p>
+    <w:tbl>
+      <w:tblPr>
+        <w:tblW w:type="dxa" w:w="9638"/>
+        <w:tblBorders>
+          <w:top w:val="single" w:color="auto" w:sz="4"/>
+          <w:left w:val="single" w:color="auto" w:sz="4"/>
+          <w:bottom w:val="single" w:color="auto" w:sz="4"/>
+          <w:right w:val="single" w:color="auto" w:sz="4"/>
+          <w:insideH w:val="single" w:color="auto" w:sz="4"/>
+          <w:insideV w:val="single" w:color="auto" w:sz="4"/>
+        </w:tblBorders>
+        <w:tblLayout w:type="fixed"/>
+      </w:tblPr>
+      <w:tblGrid>
+        <w:gridCol w:w="9638"/>
+      </w:tblGrid>
+      <w:tr>
+        <w:tc>
+          <w:tcPr>
+            <w:tcW w:type="dxa" w:w="9638"/>
+            <w:tcBorders>
+              <w:top w:val="single" w:color="D6E4F7" w:sz="6"/>
+              <w:left w:val="single" w:color="D6E4F7" w:sz="6"/>
+              <w:bottom w:val="single" w:color="D6E4F7" w:sz="6"/>
+              <w:right w:val="single" w:color="D6E4F7" w:sz="6"/>
+            </w:tcBorders>
+            <w:shd w:fill="F6F9FE" w:color="auto" w:val="clear"/>
+            <w:tcMar>
+              <w:top w:type="dxa" w:w="90"/>
+              <w:left w:type="dxa" w:w="140"/>
+              <w:bottom w:type="dxa" w:w="90"/>
+              <w:right w:type="dxa" w:w="140"/>
+            </w:tcMar>
+          </w:tcPr>
+          <w:p>
+            <w:pPr>
+              <w:spacing w:after="40"/>
+            </w:pPr>
+            <w:r>
+              <w:rPr>
+                <w:b/>
+                <w:bCs/>
+                <w:color w:val="1A5FB4"/>
+                <w:sz w:val="18"/>
+                <w:szCs w:val="18"/>
+              </w:rPr>
+              <w:t xml:space="preserve">Cevap</w:t>
+            </w:r>
+          </w:p>
+          <w:p>
+            <w:pPr>
+              <w:spacing w:after="60"/>
+            </w:pPr>
+            <w:r>
+              <w:t xml:space="preserve"/>
+            </w:r>
+          </w:p>
+          <w:p>
+            <w:pPr>
+              <w:spacing w:after="60"/>
+            </w:pPr>
+            <w:r>
+              <w:t xml:space="preserve"/>
+            </w:r>
+          </w:p>
+          <w:p>
+            <w:pPr>
+              <w:spacing w:after="60"/>
+            </w:pPr>
+            <w:r>
+              <w:t xml:space="preserve"/>
+            </w:r>
+          </w:p>
+        </w:tc>
+      </w:tr>
+    </w:tbl>
+    <w:p>
+      <w:pPr>
+        <w:spacing w:after="160"/>
+      </w:pPr>
+    </w:p>
+    <w:p>
+      <w:pPr>
+        <w:keepNext/>
+        <w:keepLines/>
+        <w:spacing w:after="100" w:before="200"/>
+      </w:pPr>
+      <w:r>
+        <w:rPr>
+          <w:b/>
+          <w:bCs/>
+          <w:color w:val="1A5FB4"/>
+        </w:rPr>
+        <w:t xml:space="preserve">Soru 12.13</w:t>
+      </w:r>
+      <w:r>
+        <w:t xml:space="preserve"> — Süreli testlerin sonucunda artık "Süre ve strateji" kartı var:</w:t>
+      </w:r>
+    </w:p>
+    <w:p>
+      <w:pPr>
+        <w:pStyle w:val="ListParagraph"/>
+        <w:keepNext/>
+        <w:numPr>
+          <w:ilvl w:val="0"/>
+          <w:numId w:val="2"/>
+        </w:numPr>
+        <w:spacing w:after="60"/>
+      </w:pPr>
+      <w:r>
+        <w:t xml:space="preserve">Hedef sürenin 2 katından uzun kalınan sorular "takıldığın sorular" sayılıyor.</w:t>
+      </w:r>
+    </w:p>
+    <w:p>
+      <w:pPr>
+        <w:pStyle w:val="ListParagraph"/>
+        <w:keepNext/>
+        <w:numPr>
+          <w:ilvl w:val="0"/>
+          <w:numId w:val="2"/>
+        </w:numPr>
+        <w:spacing w:after="60"/>
+      </w:pPr>
+      <w:r>
+        <w:t xml:space="preserve">Son 10 dakikada kaç soru işaretlendiği ve turlama yapılıp yapılmadığı gösteriliyor.</w:t>
+      </w:r>
+    </w:p>
+    <w:p>
+      <w:pPr>
+        <w:pStyle w:val="ListParagraph"/>
+        <w:keepNext w:val="false"/>
+        <w:numPr>
+          <w:ilvl w:val="0"/>
+          <w:numId w:val="2"/>
+        </w:numPr>
+        <w:spacing w:after="60"/>
+      </w:pPr>
+      <w:r>
+        <w:t xml:space="preserve">Bunlardan 1-3 kısa tavsiye çıkıyor.</w:t>
+      </w:r>
+    </w:p>
+    <w:p>
+      <w:pPr>
+        <w:spacing w:after="60"/>
+      </w:pPr>
+    </w:p>
+    <w:p>
+      <w:pPr>
+        <w:keepNext/>
+        <w:spacing w:after="120"/>
+      </w:pPr>
+      <w:r>
+        <w:t xml:space="preserve">Eşikler ve tavsiye dili uygun mu? Öğrencilere önerdiğiniz bir turlama tekniği varsa onu yazalım.</w:t>
       </w:r>
     </w:p>
     <w:tbl>

</xml_diff>

<commit_message>
Belgeler ve CI: backend duman testi, şema-migration denetimi, eski raporlar arşivde
- CI: main'de koşular birbirini iptal etmiyor; check-up işinde
  "prisma migrate diff --exit-code"; yeni backend-smoke işi (Postgres,
  seed:admin, sunucu, smoke, test:contact); test:plan, test:tutarlilik,
  test:ip, i18n:check.
- README doğrulama tablosu CI'nin gerçekte yaptığıyla eşit;
  AUTH_COOKIE_DOMAIN'in backend VE frontend'de gerektiği yazıyor.
- DEPLOY: ilk kurulumda seviyeli paketler, Traefik trustedIPs uyarısı,
  saklama ayarı, CORS listesi.
- PLAN, app README ve CHECKUP: ceza varsayımı (0,25), yeni ekranlar,
  yeniden puanlama.
- Eski raporlar "tarihsel" notuyla docs/arsiv'e taşındı.
- YOL-HARITASI §1.1: güvenlik ve hukuk işleri; HOCAYA §12.14-12.17 ve
  Word sürümü.

Co-Authored-By: Claude Opus 5.5 <noreply@anthropic.com>
</commit_message>
<xml_diff>
--- a/HOCAYA-SORULAR.docx
+++ b/HOCAYA-SORULAR.docx
@@ -13879,6 +13879,491 @@
       </w:pPr>
       <w:r>
         <w:t xml:space="preserve">Eşikler ve tavsiye dili uygun mu? Öğrencilere önerdiğiniz bir turlama tekniği varsa onu yazalım.</w:t>
+      </w:r>
+    </w:p>
+    <w:tbl>
+      <w:tblPr>
+        <w:tblW w:type="dxa" w:w="9638"/>
+        <w:tblBorders>
+          <w:top w:val="single" w:color="auto" w:sz="4"/>
+          <w:left w:val="single" w:color="auto" w:sz="4"/>
+          <w:bottom w:val="single" w:color="auto" w:sz="4"/>
+          <w:right w:val="single" w:color="auto" w:sz="4"/>
+          <w:insideH w:val="single" w:color="auto" w:sz="4"/>
+          <w:insideV w:val="single" w:color="auto" w:sz="4"/>
+        </w:tblBorders>
+        <w:tblLayout w:type="fixed"/>
+      </w:tblPr>
+      <w:tblGrid>
+        <w:gridCol w:w="9638"/>
+      </w:tblGrid>
+      <w:tr>
+        <w:tc>
+          <w:tcPr>
+            <w:tcW w:type="dxa" w:w="9638"/>
+            <w:tcBorders>
+              <w:top w:val="single" w:color="D6E4F7" w:sz="6"/>
+              <w:left w:val="single" w:color="D6E4F7" w:sz="6"/>
+              <w:bottom w:val="single" w:color="D6E4F7" w:sz="6"/>
+              <w:right w:val="single" w:color="D6E4F7" w:sz="6"/>
+            </w:tcBorders>
+            <w:shd w:fill="F6F9FE" w:color="auto" w:val="clear"/>
+            <w:tcMar>
+              <w:top w:type="dxa" w:w="90"/>
+              <w:left w:type="dxa" w:w="140"/>
+              <w:bottom w:type="dxa" w:w="90"/>
+              <w:right w:type="dxa" w:w="140"/>
+            </w:tcMar>
+          </w:tcPr>
+          <w:p>
+            <w:pPr>
+              <w:spacing w:after="40"/>
+            </w:pPr>
+            <w:r>
+              <w:rPr>
+                <w:b/>
+                <w:bCs/>
+                <w:color w:val="1A5FB4"/>
+                <w:sz w:val="18"/>
+                <w:szCs w:val="18"/>
+              </w:rPr>
+              <w:t xml:space="preserve">Cevap</w:t>
+            </w:r>
+          </w:p>
+          <w:p>
+            <w:pPr>
+              <w:spacing w:after="60"/>
+            </w:pPr>
+            <w:r>
+              <w:t xml:space="preserve"/>
+            </w:r>
+          </w:p>
+          <w:p>
+            <w:pPr>
+              <w:spacing w:after="60"/>
+            </w:pPr>
+            <w:r>
+              <w:t xml:space="preserve"/>
+            </w:r>
+          </w:p>
+          <w:p>
+            <w:pPr>
+              <w:spacing w:after="60"/>
+            </w:pPr>
+            <w:r>
+              <w:t xml:space="preserve"/>
+            </w:r>
+          </w:p>
+        </w:tc>
+      </w:tr>
+    </w:tbl>
+    <w:p>
+      <w:pPr>
+        <w:spacing w:after="160"/>
+      </w:pPr>
+    </w:p>
+    <w:p>
+      <w:pPr>
+        <w:keepNext/>
+        <w:keepLines/>
+        <w:spacing w:after="100" w:before="200"/>
+      </w:pPr>
+      <w:r>
+        <w:rPr>
+          <w:b/>
+          <w:bCs/>
+          <w:color w:val="1A5FB4"/>
+        </w:rPr>
+        <w:t xml:space="preserve">Soru 12.14</w:t>
+      </w:r>
+      <w:r>
+        <w:t xml:space="preserve"> — Seviye 1'de öğrenciye her kazanımdan değil, sıradaki ilk N kazanımdan soru geliyor (TYT'de 50). Bu sıra şu an konu ağacındaki kardeş sırasıyla kuruluyor ve müfredat sırasını tutmuyor. Hangisi olsun?</w:t>
+      </w:r>
+    </w:p>
+    <w:p>
+      <w:pPr>
+        <w:pStyle w:val="ListParagraph"/>
+        <w:keepNext/>
+        <w:numPr>
+          <w:ilvl w:val="0"/>
+          <w:numId w:val="2"/>
+        </w:numPr>
+        <w:spacing w:after="60"/>
+      </w:pPr>
+      <w:r>
+        <w:t xml:space="preserve">(a) Müfredat sırasıyla ilk N kazanım (ilk ünitelere yığılır, ör. TYT'de geometri hiç sorulmayabilir).</w:t>
+      </w:r>
+    </w:p>
+    <w:p>
+      <w:pPr>
+        <w:pStyle w:val="ListParagraph"/>
+        <w:keepNext/>
+        <w:numPr>
+          <w:ilvl w:val="0"/>
+          <w:numId w:val="2"/>
+        </w:numPr>
+        <w:spacing w:after="60"/>
+      </w:pPr>
+      <w:r>
+        <w:t xml:space="preserve">(b) Her üniteye sınavdaki ağırlığına göre pay.</w:t>
+      </w:r>
+    </w:p>
+    <w:p>
+      <w:pPr>
+        <w:pStyle w:val="ListParagraph"/>
+        <w:keepNext w:val="false"/>
+        <w:numPr>
+          <w:ilvl w:val="0"/>
+          <w:numId w:val="2"/>
+        </w:numPr>
+        <w:spacing w:after="60"/>
+      </w:pPr>
+      <w:r>
+        <w:t xml:space="preserve">(c) İçerik ekibinin elle işaretlediği bir "Seviye 1 listesi".</w:t>
+      </w:r>
+    </w:p>
+    <w:p>
+      <w:pPr>
+        <w:spacing w:after="60"/>
+      </w:pPr>
+    </w:p>
+    <w:p>
+      <w:pPr>
+        <w:keepNext/>
+        <w:spacing w:after="120"/>
+      </w:pPr>
+      <w:r>
+        <w:t xml:space="preserve">Önerimiz (b) ya da (c). Karar gelene kadar bugünkü sıra kalıyor.</w:t>
+      </w:r>
+    </w:p>
+    <w:tbl>
+      <w:tblPr>
+        <w:tblW w:type="dxa" w:w="9638"/>
+        <w:tblBorders>
+          <w:top w:val="single" w:color="auto" w:sz="4"/>
+          <w:left w:val="single" w:color="auto" w:sz="4"/>
+          <w:bottom w:val="single" w:color="auto" w:sz="4"/>
+          <w:right w:val="single" w:color="auto" w:sz="4"/>
+          <w:insideH w:val="single" w:color="auto" w:sz="4"/>
+          <w:insideV w:val="single" w:color="auto" w:sz="4"/>
+        </w:tblBorders>
+        <w:tblLayout w:type="fixed"/>
+      </w:tblPr>
+      <w:tblGrid>
+        <w:gridCol w:w="9638"/>
+      </w:tblGrid>
+      <w:tr>
+        <w:tc>
+          <w:tcPr>
+            <w:tcW w:type="dxa" w:w="9638"/>
+            <w:tcBorders>
+              <w:top w:val="single" w:color="D6E4F7" w:sz="6"/>
+              <w:left w:val="single" w:color="D6E4F7" w:sz="6"/>
+              <w:bottom w:val="single" w:color="D6E4F7" w:sz="6"/>
+              <w:right w:val="single" w:color="D6E4F7" w:sz="6"/>
+            </w:tcBorders>
+            <w:shd w:fill="F6F9FE" w:color="auto" w:val="clear"/>
+            <w:tcMar>
+              <w:top w:type="dxa" w:w="90"/>
+              <w:left w:type="dxa" w:w="140"/>
+              <w:bottom w:type="dxa" w:w="90"/>
+              <w:right w:type="dxa" w:w="140"/>
+            </w:tcMar>
+          </w:tcPr>
+          <w:p>
+            <w:pPr>
+              <w:spacing w:after="40"/>
+            </w:pPr>
+            <w:r>
+              <w:rPr>
+                <w:b/>
+                <w:bCs/>
+                <w:color w:val="1A5FB4"/>
+                <w:sz w:val="18"/>
+                <w:szCs w:val="18"/>
+              </w:rPr>
+              <w:t xml:space="preserve">Cevap</w:t>
+            </w:r>
+          </w:p>
+          <w:p>
+            <w:pPr>
+              <w:spacing w:after="60"/>
+            </w:pPr>
+            <w:r>
+              <w:t xml:space="preserve"/>
+            </w:r>
+          </w:p>
+          <w:p>
+            <w:pPr>
+              <w:spacing w:after="60"/>
+            </w:pPr>
+            <w:r>
+              <w:t xml:space="preserve"/>
+            </w:r>
+          </w:p>
+          <w:p>
+            <w:pPr>
+              <w:spacing w:after="60"/>
+            </w:pPr>
+            <w:r>
+              <w:t xml:space="preserve"/>
+            </w:r>
+          </w:p>
+        </w:tc>
+      </w:tr>
+    </w:tbl>
+    <w:p>
+      <w:pPr>
+        <w:spacing w:after="160"/>
+      </w:pPr>
+    </w:p>
+    <w:p>
+      <w:pPr>
+        <w:keepNext/>
+        <w:keepLines/>
+        <w:spacing w:after="100" w:before="200"/>
+      </w:pPr>
+      <w:r>
+        <w:rPr>
+          <w:b/>
+          <w:bCs/>
+          <w:color w:val="1A5FB4"/>
+        </w:rPr>
+        <w:t xml:space="preserve">Soru 12.15</w:t>
+      </w:r>
+      <w:r>
+        <w:t xml:space="preserve"> — Sonuç ekranındaki yayın önerileri artık öğrencinin sınavına göre süzülüyor. İki eşleşme sizin onayınızı bekliyor:</w:t>
+      </w:r>
+    </w:p>
+    <w:p>
+      <w:pPr>
+        <w:pStyle w:val="ListParagraph"/>
+        <w:keepNext/>
+        <w:numPr>
+          <w:ilvl w:val="0"/>
+          <w:numId w:val="2"/>
+        </w:numPr>
+        <w:spacing w:after="60"/>
+      </w:pPr>
+      <w:r>
+        <w:t xml:space="preserve">"Muhteşem Üçlü" sitede yalnızca AYT ürünü, ama TYT'deki kümeler, mantık ve olasılık konularına bağlı. TYT öğrencisine önerilmeli mi?</w:t>
+      </w:r>
+    </w:p>
+    <w:p>
+      <w:pPr>
+        <w:pStyle w:val="ListParagraph"/>
+        <w:keepNext w:val="false"/>
+        <w:numPr>
+          <w:ilvl w:val="0"/>
+          <w:numId w:val="2"/>
+        </w:numPr>
+        <w:spacing w:after="60"/>
+      </w:pPr>
+      <w:r>
+        <w:t xml:space="preserve">"Faiz Problemleri" (KPSS, DGS, ALES) için hangi yayın önerilsin?</w:t>
+      </w:r>
+    </w:p>
+    <w:p>
+      <w:pPr>
+        <w:spacing w:after="60"/>
+      </w:pPr>
+    </w:p>
+    <w:tbl>
+      <w:tblPr>
+        <w:tblW w:type="dxa" w:w="9638"/>
+        <w:tblBorders>
+          <w:top w:val="single" w:color="auto" w:sz="4"/>
+          <w:left w:val="single" w:color="auto" w:sz="4"/>
+          <w:bottom w:val="single" w:color="auto" w:sz="4"/>
+          <w:right w:val="single" w:color="auto" w:sz="4"/>
+          <w:insideH w:val="single" w:color="auto" w:sz="4"/>
+          <w:insideV w:val="single" w:color="auto" w:sz="4"/>
+        </w:tblBorders>
+        <w:tblLayout w:type="fixed"/>
+      </w:tblPr>
+      <w:tblGrid>
+        <w:gridCol w:w="9638"/>
+      </w:tblGrid>
+      <w:tr>
+        <w:tc>
+          <w:tcPr>
+            <w:tcW w:type="dxa" w:w="9638"/>
+            <w:tcBorders>
+              <w:top w:val="single" w:color="D6E4F7" w:sz="6"/>
+              <w:left w:val="single" w:color="D6E4F7" w:sz="6"/>
+              <w:bottom w:val="single" w:color="D6E4F7" w:sz="6"/>
+              <w:right w:val="single" w:color="D6E4F7" w:sz="6"/>
+            </w:tcBorders>
+            <w:shd w:fill="F6F9FE" w:color="auto" w:val="clear"/>
+            <w:tcMar>
+              <w:top w:type="dxa" w:w="90"/>
+              <w:left w:type="dxa" w:w="140"/>
+              <w:bottom w:type="dxa" w:w="90"/>
+              <w:right w:type="dxa" w:w="140"/>
+            </w:tcMar>
+          </w:tcPr>
+          <w:p>
+            <w:pPr>
+              <w:spacing w:after="40"/>
+            </w:pPr>
+            <w:r>
+              <w:rPr>
+                <w:b/>
+                <w:bCs/>
+                <w:color w:val="1A5FB4"/>
+                <w:sz w:val="18"/>
+                <w:szCs w:val="18"/>
+              </w:rPr>
+              <w:t xml:space="preserve">Cevap</w:t>
+            </w:r>
+          </w:p>
+          <w:p>
+            <w:pPr>
+              <w:spacing w:after="60"/>
+            </w:pPr>
+            <w:r>
+              <w:t xml:space="preserve"/>
+            </w:r>
+          </w:p>
+          <w:p>
+            <w:pPr>
+              <w:spacing w:after="60"/>
+            </w:pPr>
+            <w:r>
+              <w:t xml:space="preserve"/>
+            </w:r>
+          </w:p>
+          <w:p>
+            <w:pPr>
+              <w:spacing w:after="60"/>
+            </w:pPr>
+            <w:r>
+              <w:t xml:space="preserve"/>
+            </w:r>
+          </w:p>
+        </w:tc>
+      </w:tr>
+    </w:tbl>
+    <w:p>
+      <w:pPr>
+        <w:spacing w:after="160"/>
+      </w:pPr>
+    </w:p>
+    <w:p>
+      <w:pPr>
+        <w:keepNext/>
+        <w:keepLines/>
+        <w:spacing w:after="100" w:before="200"/>
+      </w:pPr>
+      <w:r>
+        <w:rPr>
+          <w:b/>
+          <w:bCs/>
+          <w:color w:val="1A5FB4"/>
+        </w:rPr>
+        <w:t xml:space="preserve">Soru 12.16</w:t>
+      </w:r>
+      <w:r>
+        <w:t xml:space="preserve"> — Haftalık plan: bitmeyen işler sonraki haftaya devretsin mi? Şu an her hafta plan sıfırdan ve yalnızca o haftanın ilk testinden sonra kuruluyor; pazartesi sabahı çoğu öğrencinin planı yok. Önerimiz: pazartesi bitmemiş işler kendiliğinden yeni haftaya taşınsın, haftanın ilk testi bu planı genişletsin.</w:t>
+      </w:r>
+    </w:p>
+    <w:tbl>
+      <w:tblPr>
+        <w:tblW w:type="dxa" w:w="9638"/>
+        <w:tblBorders>
+          <w:top w:val="single" w:color="auto" w:sz="4"/>
+          <w:left w:val="single" w:color="auto" w:sz="4"/>
+          <w:bottom w:val="single" w:color="auto" w:sz="4"/>
+          <w:right w:val="single" w:color="auto" w:sz="4"/>
+          <w:insideH w:val="single" w:color="auto" w:sz="4"/>
+          <w:insideV w:val="single" w:color="auto" w:sz="4"/>
+        </w:tblBorders>
+        <w:tblLayout w:type="fixed"/>
+      </w:tblPr>
+      <w:tblGrid>
+        <w:gridCol w:w="9638"/>
+      </w:tblGrid>
+      <w:tr>
+        <w:tc>
+          <w:tcPr>
+            <w:tcW w:type="dxa" w:w="9638"/>
+            <w:tcBorders>
+              <w:top w:val="single" w:color="D6E4F7" w:sz="6"/>
+              <w:left w:val="single" w:color="D6E4F7" w:sz="6"/>
+              <w:bottom w:val="single" w:color="D6E4F7" w:sz="6"/>
+              <w:right w:val="single" w:color="D6E4F7" w:sz="6"/>
+            </w:tcBorders>
+            <w:shd w:fill="F6F9FE" w:color="auto" w:val="clear"/>
+            <w:tcMar>
+              <w:top w:type="dxa" w:w="90"/>
+              <w:left w:type="dxa" w:w="140"/>
+              <w:bottom w:type="dxa" w:w="90"/>
+              <w:right w:type="dxa" w:w="140"/>
+            </w:tcMar>
+          </w:tcPr>
+          <w:p>
+            <w:pPr>
+              <w:spacing w:after="40"/>
+            </w:pPr>
+            <w:r>
+              <w:rPr>
+                <w:b/>
+                <w:bCs/>
+                <w:color w:val="1A5FB4"/>
+                <w:sz w:val="18"/>
+                <w:szCs w:val="18"/>
+              </w:rPr>
+              <w:t xml:space="preserve">Cevap</w:t>
+            </w:r>
+          </w:p>
+          <w:p>
+            <w:pPr>
+              <w:spacing w:after="60"/>
+            </w:pPr>
+            <w:r>
+              <w:t xml:space="preserve"/>
+            </w:r>
+          </w:p>
+          <w:p>
+            <w:pPr>
+              <w:spacing w:after="60"/>
+            </w:pPr>
+            <w:r>
+              <w:t xml:space="preserve"/>
+            </w:r>
+          </w:p>
+          <w:p>
+            <w:pPr>
+              <w:spacing w:after="60"/>
+            </w:pPr>
+            <w:r>
+              <w:t xml:space="preserve"/>
+            </w:r>
+          </w:p>
+        </w:tc>
+      </w:tr>
+    </w:tbl>
+    <w:p>
+      <w:pPr>
+        <w:spacing w:after="160"/>
+      </w:pPr>
+    </w:p>
+    <w:p>
+      <w:pPr>
+        <w:keepNext/>
+        <w:keepLines/>
+        <w:spacing w:after="100" w:before="200"/>
+      </w:pPr>
+      <w:r>
+        <w:rPr>
+          <w:b/>
+          <w:bCs/>
+          <w:color w:val="1A5FB4"/>
+        </w:rPr>
+        <w:t xml:space="preserve">Soru 12.17</w:t>
+      </w:r>
+      <w:r>
+        <w:t xml:space="preserve"> — Plandaki "N soru çöz" işini öğrenci elle işaretliyor (kitaptan çözdüğü sorular uygulamada görünmüyor). Koçun ödevi ise sistemden okunuyor. Önerimiz: uygulamada hedefe ulaşınca iş kendiliğinden işaretlensin, elle işaret de kalsın; "planı yapmıyor" uyarısı yalnızca kontrol testlerine dayansın. Uygun mu?</w:t>
       </w:r>
     </w:p>
     <w:tbl>

</xml_diff>